<commit_message>
assignement 1 & 2 completed
</commit_message>
<xml_diff>
--- a/2. Python/Assignment 1/ASSIGNMENT 1 solution.docx
+++ b/2. Python/Assignment 1/ASSIGNMENT 1 solution.docx
@@ -79,7 +79,7 @@
         <w:ind w:left="360"/>
       </w:pPr>
       <w:r>
-        <w:t>Guido van Rossum developed Python, and it was initially released in 1991.</w:t>
+        <w:t>Guido van Rossum developed Python, and it was released in 1991.</w:t>
       </w:r>
     </w:p>
     <w:p>
@@ -207,7 +207,13 @@
       </w:r>
       <w:proofErr w:type="gramEnd"/>
       <w:r>
-        <w:t>) becoming a function) and native Unicode support; Python 2 is legacy and has reached its end of life.</w:t>
+        <w:t>) becoming a function) and native Unicode support</w:t>
+      </w:r>
+      <w:r>
+        <w:t xml:space="preserve">. </w:t>
+      </w:r>
+      <w:r>
+        <w:t>Python 2 is legacy and has reached its end of life.</w:t>
       </w:r>
     </w:p>
     <w:p>
@@ -609,9 +615,2576 @@
         <w:rPr>
           <w:b/>
           <w:bCs/>
-          <w:lang w:val="en-US"/>
-        </w:rPr>
-      </w:pPr>
+        </w:rPr>
+      </w:pPr>
+      <w:r>
+        <w:rPr>
+          <w:b/>
+          <w:bCs/>
+        </w:rPr>
+        <w:t>3. Variables &amp; Data Types</w:t>
+      </w:r>
+    </w:p>
+    <w:p>
+      <w:pPr>
+        <w:ind w:left="360"/>
+      </w:pPr>
+      <w:r>
+        <w:rPr>
+          <w:b/>
+          <w:bCs/>
+        </w:rPr>
+        <w:t>21. What is a variable in Python?</w:t>
+      </w:r>
+      <w:r>
+        <w:t xml:space="preserve"> </w:t>
+      </w:r>
+    </w:p>
+    <w:p>
+      <w:pPr>
+        <w:ind w:left="360"/>
+      </w:pPr>
+      <w:r>
+        <w:t>A named reference to a location in memory used to store data.</w:t>
+      </w:r>
+    </w:p>
+    <w:p>
+      <w:pPr>
+        <w:ind w:left="360"/>
+      </w:pPr>
+      <w:r>
+        <w:rPr>
+          <w:b/>
+          <w:bCs/>
+        </w:rPr>
+        <w:t>22. What are the rules for naming variables?</w:t>
+      </w:r>
+      <w:r>
+        <w:t xml:space="preserve"> </w:t>
+      </w:r>
+    </w:p>
+    <w:p>
+      <w:pPr>
+        <w:ind w:left="360"/>
+      </w:pPr>
+      <w:r>
+        <w:t>They must start with a letter or underscore, contain only alphanumeric characters and underscores, and cannot be reserved keywords.</w:t>
+      </w:r>
+    </w:p>
+    <w:p>
+      <w:pPr>
+        <w:ind w:left="360"/>
+      </w:pPr>
+      <w:r>
+        <w:rPr>
+          <w:b/>
+          <w:bCs/>
+        </w:rPr>
+        <w:t>23. What is dynamic typing in Python?</w:t>
+      </w:r>
+      <w:r>
+        <w:t xml:space="preserve"> </w:t>
+      </w:r>
+    </w:p>
+    <w:p>
+      <w:pPr>
+        <w:ind w:left="360"/>
+      </w:pPr>
+      <w:r>
+        <w:t>You do not need to declare a variable's type before assigning it; Python infers the type at runtime.</w:t>
+      </w:r>
+    </w:p>
+    <w:p>
+      <w:pPr>
+        <w:ind w:left="360"/>
+      </w:pPr>
+      <w:r>
+        <w:rPr>
+          <w:b/>
+          <w:bCs/>
+        </w:rPr>
+        <w:t>24. What are built-in data types in Python?</w:t>
+      </w:r>
+      <w:r>
+        <w:t xml:space="preserve"> </w:t>
+      </w:r>
+    </w:p>
+    <w:p>
+      <w:pPr>
+        <w:ind w:left="360"/>
+      </w:pPr>
+      <w:r>
+        <w:t xml:space="preserve">Integers, floats, </w:t>
+      </w:r>
+      <w:proofErr w:type="spellStart"/>
+      <w:r>
+        <w:t>booleans</w:t>
+      </w:r>
+      <w:proofErr w:type="spellEnd"/>
+      <w:r>
+        <w:t>, strings, lists, tuples, dictionaries, and sets.</w:t>
+      </w:r>
+    </w:p>
+    <w:p>
+      <w:pPr>
+        <w:ind w:left="360"/>
+      </w:pPr>
+      <w:r>
+        <w:rPr>
+          <w:b/>
+          <w:bCs/>
+        </w:rPr>
+        <w:t>25. What is the difference between int and float?</w:t>
+      </w:r>
+      <w:r>
+        <w:t xml:space="preserve"> </w:t>
+      </w:r>
+    </w:p>
+    <w:p>
+      <w:pPr>
+        <w:ind w:left="360"/>
+      </w:pPr>
+      <w:r>
+        <w:t>int represents whole numbers, while float represents numbers with decimal points.</w:t>
+      </w:r>
+    </w:p>
+    <w:p>
+      <w:pPr>
+        <w:ind w:left="360"/>
+      </w:pPr>
+      <w:r>
+        <w:rPr>
+          <w:b/>
+          <w:bCs/>
+        </w:rPr>
+        <w:t>26. What is a complex number in Python?</w:t>
+      </w:r>
+      <w:r>
+        <w:t xml:space="preserve"> </w:t>
+      </w:r>
+    </w:p>
+    <w:p>
+      <w:pPr>
+        <w:ind w:left="360"/>
+      </w:pPr>
+      <w:r>
+        <w:t>A number consisting of a real part and an imaginary part (e.g., 3 + 4j).</w:t>
+      </w:r>
+    </w:p>
+    <w:p>
+      <w:pPr>
+        <w:ind w:left="360"/>
+      </w:pPr>
+      <w:r>
+        <w:rPr>
+          <w:b/>
+          <w:bCs/>
+        </w:rPr>
+        <w:t>27. What is the bool data type?</w:t>
+      </w:r>
+      <w:r>
+        <w:t xml:space="preserve"> </w:t>
+      </w:r>
+    </w:p>
+    <w:p>
+      <w:pPr>
+        <w:ind w:left="360"/>
+      </w:pPr>
+      <w:r>
+        <w:t>A data type that represents one of two values: True or False.</w:t>
+      </w:r>
+    </w:p>
+    <w:p>
+      <w:pPr>
+        <w:ind w:left="360"/>
+      </w:pPr>
+      <w:r>
+        <w:rPr>
+          <w:b/>
+          <w:bCs/>
+        </w:rPr>
+        <w:t>28. What does the None data type represent?</w:t>
+      </w:r>
+      <w:r>
+        <w:t xml:space="preserve"> </w:t>
+      </w:r>
+    </w:p>
+    <w:p>
+      <w:pPr>
+        <w:ind w:left="360"/>
+      </w:pPr>
+      <w:r>
+        <w:t>It represents the intentional absence of a value or a null value.</w:t>
+      </w:r>
+    </w:p>
+    <w:p>
+      <w:pPr>
+        <w:ind w:left="360"/>
+      </w:pPr>
+      <w:r>
+        <w:rPr>
+          <w:b/>
+          <w:bCs/>
+        </w:rPr>
+        <w:t>29. How do you check the type of a variable?</w:t>
+      </w:r>
+    </w:p>
+    <w:p>
+      <w:pPr>
+        <w:ind w:left="360"/>
+      </w:pPr>
+      <w:r>
+        <w:t xml:space="preserve">Using the built-in </w:t>
+      </w:r>
+      <w:proofErr w:type="gramStart"/>
+      <w:r>
+        <w:t>type(</w:t>
+      </w:r>
+      <w:proofErr w:type="gramEnd"/>
+      <w:r>
+        <w:t>) function.</w:t>
+      </w:r>
+    </w:p>
+    <w:p>
+      <w:pPr>
+        <w:ind w:left="360"/>
+      </w:pPr>
+      <w:r>
+        <w:rPr>
+          <w:b/>
+          <w:bCs/>
+        </w:rPr>
+        <w:lastRenderedPageBreak/>
+        <w:t>30. What is type casting?</w:t>
+      </w:r>
+      <w:r>
+        <w:t xml:space="preserve"> </w:t>
+      </w:r>
+    </w:p>
+    <w:p>
+      <w:pPr>
+        <w:ind w:left="360"/>
+      </w:pPr>
+      <w:r>
+        <w:t>The process of converting a variable from one data type to another.</w:t>
+      </w:r>
+    </w:p>
+    <w:p>
+      <w:pPr>
+        <w:ind w:left="360"/>
+      </w:pPr>
+      <w:r>
+        <w:rPr>
+          <w:b/>
+          <w:bCs/>
+        </w:rPr>
+        <w:t>31. How do you convert a string to an integer?</w:t>
+      </w:r>
+      <w:r>
+        <w:t xml:space="preserve"> </w:t>
+      </w:r>
+    </w:p>
+    <w:p>
+      <w:pPr>
+        <w:ind w:left="360"/>
+      </w:pPr>
+      <w:r>
+        <w:t xml:space="preserve">By passing the string into the </w:t>
+      </w:r>
+      <w:proofErr w:type="gramStart"/>
+      <w:r>
+        <w:t>int(</w:t>
+      </w:r>
+      <w:proofErr w:type="gramEnd"/>
+      <w:r>
+        <w:t>) function (e.g., int("5")).</w:t>
+      </w:r>
+    </w:p>
+    <w:p>
+      <w:pPr>
+        <w:ind w:left="360"/>
+      </w:pPr>
+      <w:r>
+        <w:rPr>
+          <w:b/>
+          <w:bCs/>
+        </w:rPr>
+        <w:t>32. What is the difference between mutable and immutable data types?</w:t>
+      </w:r>
+      <w:r>
+        <w:t xml:space="preserve"> </w:t>
+      </w:r>
+    </w:p>
+    <w:p>
+      <w:pPr>
+        <w:ind w:left="360"/>
+      </w:pPr>
+      <w:r>
+        <w:t>Mutable objects can have their contents changed after creation; immutable objects cannot be altered in memory once created.</w:t>
+      </w:r>
+    </w:p>
+    <w:p>
+      <w:pPr>
+        <w:ind w:left="360"/>
+      </w:pPr>
+      <w:r>
+        <w:rPr>
+          <w:b/>
+          <w:bCs/>
+        </w:rPr>
+        <w:t>33. Which Python data types are immutable?</w:t>
+      </w:r>
+      <w:r>
+        <w:t xml:space="preserve"> </w:t>
+      </w:r>
+    </w:p>
+    <w:p>
+      <w:pPr>
+        <w:ind w:left="360"/>
+      </w:pPr>
+      <w:r>
+        <w:t xml:space="preserve">Integers, floats, </w:t>
+      </w:r>
+      <w:proofErr w:type="spellStart"/>
+      <w:r>
+        <w:t>booleans</w:t>
+      </w:r>
+      <w:proofErr w:type="spellEnd"/>
+      <w:r>
+        <w:t>, strings, and tuples.</w:t>
+      </w:r>
+    </w:p>
+    <w:p>
+      <w:pPr>
+        <w:ind w:left="360"/>
+      </w:pPr>
+      <w:r>
+        <w:rPr>
+          <w:b/>
+          <w:bCs/>
+        </w:rPr>
+        <w:t>34. Which Python data types are mutable?</w:t>
+      </w:r>
+      <w:r>
+        <w:t xml:space="preserve"> </w:t>
+      </w:r>
+    </w:p>
+    <w:p>
+      <w:pPr>
+        <w:ind w:left="360"/>
+      </w:pPr>
+      <w:r>
+        <w:t>Lists, dictionaries, and sets.</w:t>
+      </w:r>
+    </w:p>
+    <w:p>
+      <w:pPr>
+        <w:ind w:left="360"/>
+      </w:pPr>
+      <w:r>
+        <w:rPr>
+          <w:b/>
+          <w:bCs/>
+        </w:rPr>
+        <w:t>35. What is multiple variable assignment?</w:t>
+      </w:r>
+      <w:r>
+        <w:t xml:space="preserve"> </w:t>
+      </w:r>
+    </w:p>
+    <w:p>
+      <w:pPr>
+        <w:ind w:left="360"/>
+      </w:pPr>
+      <w:r>
+        <w:t>Assigning values to several variables in a single line of code (e.g., a, b = 1, 2).</w:t>
+      </w:r>
+    </w:p>
+    <w:p>
+      <w:pPr>
+        <w:rPr>
+          <w:b/>
+          <w:bCs/>
+        </w:rPr>
+      </w:pPr>
+      <w:r>
+        <w:rPr>
+          <w:b/>
+          <w:bCs/>
+        </w:rPr>
+        <w:t>4. Operators</w:t>
+      </w:r>
+    </w:p>
+    <w:p>
+      <w:pPr>
+        <w:ind w:left="360"/>
+      </w:pPr>
+      <w:r>
+        <w:rPr>
+          <w:b/>
+          <w:bCs/>
+        </w:rPr>
+        <w:t>36. What are operators in Python?</w:t>
+      </w:r>
+      <w:r>
+        <w:t xml:space="preserve"> </w:t>
+      </w:r>
+    </w:p>
+    <w:p>
+      <w:pPr>
+        <w:ind w:left="360"/>
+      </w:pPr>
+      <w:r>
+        <w:t>Special symbols used to perform operations on variables and values.</w:t>
+      </w:r>
+    </w:p>
+    <w:p>
+      <w:pPr>
+        <w:ind w:left="360"/>
+      </w:pPr>
+      <w:r>
+        <w:rPr>
+          <w:b/>
+          <w:bCs/>
+        </w:rPr>
+        <w:t>37. What are arithmetic operators?</w:t>
+      </w:r>
+      <w:r>
+        <w:t xml:space="preserve"> </w:t>
+      </w:r>
+    </w:p>
+    <w:p>
+      <w:pPr>
+        <w:ind w:left="360"/>
+      </w:pPr>
+      <w:r>
+        <w:t>Operators for math, like +, -, *, /.</w:t>
+      </w:r>
+    </w:p>
+    <w:p>
+      <w:pPr>
+        <w:ind w:left="360"/>
+      </w:pPr>
+      <w:r>
+        <w:rPr>
+          <w:b/>
+          <w:bCs/>
+        </w:rPr>
+        <w:t>38. What is the difference between / and //?</w:t>
+      </w:r>
+      <w:r>
+        <w:t xml:space="preserve"> </w:t>
+      </w:r>
+    </w:p>
+    <w:p>
+      <w:pPr>
+        <w:ind w:left="360"/>
+      </w:pPr>
+      <w:r>
+        <w:t xml:space="preserve">/ </w:t>
+      </w:r>
+      <w:proofErr w:type="gramStart"/>
+      <w:r>
+        <w:t>performs</w:t>
+      </w:r>
+      <w:proofErr w:type="gramEnd"/>
+      <w:r>
+        <w:t xml:space="preserve"> true division returning a float, while // performs floor division returning an integer rounded down.</w:t>
+      </w:r>
+    </w:p>
+    <w:p>
+      <w:pPr>
+        <w:ind w:left="360"/>
+        <w:rPr>
+          <w:b/>
+          <w:bCs/>
+        </w:rPr>
+      </w:pPr>
+      <w:r>
+        <w:rPr>
+          <w:b/>
+          <w:bCs/>
+        </w:rPr>
+        <w:t>39. What does the modulus operator % do?</w:t>
+      </w:r>
+    </w:p>
+    <w:p>
+      <w:pPr>
+        <w:ind w:left="360"/>
+      </w:pPr>
+      <w:r>
+        <w:t xml:space="preserve"> It returns the remainder of a division.</w:t>
+      </w:r>
+    </w:p>
+    <w:p>
+      <w:pPr>
+        <w:ind w:left="360"/>
+        <w:rPr>
+          <w:b/>
+          <w:bCs/>
+        </w:rPr>
+      </w:pPr>
+      <w:r>
+        <w:rPr>
+          <w:b/>
+          <w:bCs/>
+        </w:rPr>
+        <w:t>40. What are comparison operators?</w:t>
+      </w:r>
+    </w:p>
+    <w:p>
+      <w:pPr>
+        <w:ind w:left="360"/>
+      </w:pPr>
+      <w:r>
+        <w:t xml:space="preserve"> Operators like ==, &gt;, &lt; that compare values and return a Boolean.</w:t>
+      </w:r>
+    </w:p>
+    <w:p>
+      <w:pPr>
+        <w:ind w:left="360"/>
+        <w:rPr>
+          <w:b/>
+          <w:bCs/>
+        </w:rPr>
+      </w:pPr>
+      <w:r>
+        <w:rPr>
+          <w:b/>
+          <w:bCs/>
+        </w:rPr>
+        <w:t>41. What are logical operators in Python?</w:t>
+      </w:r>
+    </w:p>
+    <w:p>
+      <w:pPr>
+        <w:ind w:left="360"/>
+      </w:pPr>
+      <w:r>
+        <w:t xml:space="preserve"> and, or, and not.</w:t>
+      </w:r>
+    </w:p>
+    <w:p>
+      <w:pPr>
+        <w:ind w:left="360"/>
+        <w:rPr>
+          <w:b/>
+          <w:bCs/>
+        </w:rPr>
+      </w:pPr>
+      <w:r>
+        <w:rPr>
+          <w:b/>
+          <w:bCs/>
+        </w:rPr>
+        <w:t xml:space="preserve">42. What is the difference between and </w:t>
+      </w:r>
+      <w:proofErr w:type="spellStart"/>
+      <w:r>
+        <w:rPr>
+          <w:b/>
+          <w:bCs/>
+        </w:rPr>
+        <w:t>and</w:t>
+      </w:r>
+      <w:proofErr w:type="spellEnd"/>
+      <w:r>
+        <w:rPr>
+          <w:b/>
+          <w:bCs/>
+        </w:rPr>
+        <w:t xml:space="preserve"> or?</w:t>
+      </w:r>
+    </w:p>
+    <w:p>
+      <w:pPr>
+        <w:ind w:left="360"/>
+      </w:pPr>
+      <w:r>
+        <w:t xml:space="preserve"> and requires both conditions to be true; or requires at least one condition to be true.</w:t>
+      </w:r>
+    </w:p>
+    <w:p>
+      <w:pPr>
+        <w:ind w:left="360"/>
+        <w:rPr>
+          <w:b/>
+          <w:bCs/>
+        </w:rPr>
+      </w:pPr>
+      <w:r>
+        <w:rPr>
+          <w:b/>
+          <w:bCs/>
+        </w:rPr>
+        <w:t>43. What is the not operator?</w:t>
+      </w:r>
+    </w:p>
+    <w:p>
+      <w:pPr>
+        <w:ind w:left="360"/>
+      </w:pPr>
+      <w:r>
+        <w:t xml:space="preserve"> It reverses the logical state of a condition.</w:t>
+      </w:r>
+    </w:p>
+    <w:p>
+      <w:pPr>
+        <w:ind w:left="360"/>
+        <w:rPr>
+          <w:b/>
+          <w:bCs/>
+        </w:rPr>
+      </w:pPr>
+      <w:r>
+        <w:rPr>
+          <w:b/>
+          <w:bCs/>
+        </w:rPr>
+        <w:t>44. What are bitwise operators?</w:t>
+      </w:r>
+    </w:p>
+    <w:p>
+      <w:pPr>
+        <w:ind w:left="360"/>
+      </w:pPr>
+      <w:r>
+        <w:t xml:space="preserve"> Operators that manipulate numbers at the binary level (e.g., &amp;, |, &lt;&lt;).</w:t>
+      </w:r>
+    </w:p>
+    <w:p>
+      <w:pPr>
+        <w:ind w:left="360"/>
+        <w:rPr>
+          <w:b/>
+          <w:bCs/>
+        </w:rPr>
+      </w:pPr>
+      <w:r>
+        <w:rPr>
+          <w:b/>
+          <w:bCs/>
+        </w:rPr>
+        <w:t xml:space="preserve">45. What is the difference between &amp; and </w:t>
+      </w:r>
+      <w:proofErr w:type="spellStart"/>
+      <w:proofErr w:type="gramStart"/>
+      <w:r>
+        <w:rPr>
+          <w:b/>
+          <w:bCs/>
+        </w:rPr>
+        <w:t>and</w:t>
+      </w:r>
+      <w:proofErr w:type="spellEnd"/>
+      <w:r>
+        <w:rPr>
+          <w:b/>
+          <w:bCs/>
+        </w:rPr>
+        <w:t xml:space="preserve"> </w:t>
+      </w:r>
+      <w:r>
+        <w:rPr>
+          <w:b/>
+          <w:bCs/>
+        </w:rPr>
+        <w:t>?</w:t>
+      </w:r>
+      <w:proofErr w:type="gramEnd"/>
+    </w:p>
+    <w:p>
+      <w:pPr>
+        <w:ind w:left="360"/>
+      </w:pPr>
+      <w:r>
+        <w:t xml:space="preserve"> &amp; compares binary bits; and evaluates </w:t>
+      </w:r>
+      <w:proofErr w:type="spellStart"/>
+      <w:r>
+        <w:t>boolean</w:t>
+      </w:r>
+      <w:proofErr w:type="spellEnd"/>
+      <w:r>
+        <w:t xml:space="preserve"> logic expressions.</w:t>
+      </w:r>
+    </w:p>
+    <w:p>
+      <w:pPr>
+        <w:ind w:left="360"/>
+        <w:rPr>
+          <w:b/>
+          <w:bCs/>
+        </w:rPr>
+      </w:pPr>
+      <w:r>
+        <w:rPr>
+          <w:b/>
+          <w:bCs/>
+        </w:rPr>
+        <w:lastRenderedPageBreak/>
+        <w:t>46. What are assignment operators?</w:t>
+      </w:r>
+    </w:p>
+    <w:p>
+      <w:pPr>
+        <w:ind w:left="360"/>
+      </w:pPr>
+      <w:r>
+        <w:t xml:space="preserve"> Operators that assign values, like = or +=.</w:t>
+      </w:r>
+    </w:p>
+    <w:p>
+      <w:pPr>
+        <w:ind w:left="360"/>
+        <w:rPr>
+          <w:b/>
+          <w:bCs/>
+        </w:rPr>
+      </w:pPr>
+      <w:r>
+        <w:rPr>
+          <w:b/>
+          <w:bCs/>
+        </w:rPr>
+        <w:t>47. What are membership operators?</w:t>
+      </w:r>
+    </w:p>
+    <w:p>
+      <w:pPr>
+        <w:ind w:left="360"/>
+      </w:pPr>
+      <w:r>
+        <w:t xml:space="preserve"> Operators that test if a value is inside a sequence.</w:t>
+      </w:r>
+    </w:p>
+    <w:p>
+      <w:pPr>
+        <w:ind w:left="360"/>
+        <w:rPr>
+          <w:b/>
+          <w:bCs/>
+        </w:rPr>
+      </w:pPr>
+      <w:r>
+        <w:rPr>
+          <w:b/>
+          <w:bCs/>
+        </w:rPr>
+        <w:t>48. What is the in operator?</w:t>
+      </w:r>
+    </w:p>
+    <w:p>
+      <w:pPr>
+        <w:ind w:left="360"/>
+      </w:pPr>
+      <w:r>
+        <w:t>A membership operator that returns True if a value is found in a sequence.</w:t>
+      </w:r>
+    </w:p>
+    <w:p>
+      <w:pPr>
+        <w:ind w:left="360"/>
+        <w:rPr>
+          <w:b/>
+          <w:bCs/>
+        </w:rPr>
+      </w:pPr>
+      <w:r>
+        <w:rPr>
+          <w:b/>
+          <w:bCs/>
+        </w:rPr>
+        <w:t>49. What are identity operators?</w:t>
+      </w:r>
+    </w:p>
+    <w:p>
+      <w:pPr>
+        <w:ind w:left="360"/>
+        <w:rPr>
+          <w:b/>
+          <w:bCs/>
+        </w:rPr>
+      </w:pPr>
+      <w:r>
+        <w:t>Operators (is, is not) that check if two variables point to the exact same object in memory.</w:t>
+      </w:r>
+    </w:p>
+    <w:p>
+      <w:pPr>
+        <w:ind w:left="360"/>
+        <w:rPr>
+          <w:b/>
+          <w:bCs/>
+        </w:rPr>
+      </w:pPr>
+      <w:r>
+        <w:rPr>
+          <w:b/>
+          <w:bCs/>
+        </w:rPr>
+        <w:t>50. What is the difference between is and ==?</w:t>
+      </w:r>
+    </w:p>
+    <w:p>
+      <w:pPr>
+        <w:ind w:left="360"/>
+      </w:pPr>
+      <w:r>
+        <w:t xml:space="preserve"> is checks memory identity</w:t>
+      </w:r>
+      <w:r>
+        <w:t xml:space="preserve"> whereas</w:t>
+      </w:r>
+      <w:r>
+        <w:t xml:space="preserve"> == checks value equivalence.</w:t>
+      </w:r>
+    </w:p>
+    <w:p>
+      <w:pPr>
+        <w:rPr>
+          <w:b/>
+          <w:bCs/>
+        </w:rPr>
+      </w:pPr>
+      <w:r>
+        <w:rPr>
+          <w:b/>
+          <w:bCs/>
+        </w:rPr>
+        <w:t>5. Strings</w:t>
+      </w:r>
+    </w:p>
+    <w:p>
+      <w:pPr>
+        <w:ind w:left="360"/>
+      </w:pPr>
+      <w:r>
+        <w:rPr>
+          <w:b/>
+          <w:bCs/>
+        </w:rPr>
+        <w:t>51. What is a string in Python?</w:t>
+      </w:r>
+      <w:r>
+        <w:t xml:space="preserve"> </w:t>
+      </w:r>
+    </w:p>
+    <w:p>
+      <w:pPr>
+        <w:ind w:left="360"/>
+      </w:pPr>
+      <w:r>
+        <w:t>A sequence of characters representing text.</w:t>
+      </w:r>
+    </w:p>
+    <w:p>
+      <w:pPr>
+        <w:ind w:left="360"/>
+        <w:rPr>
+          <w:b/>
+          <w:bCs/>
+        </w:rPr>
+      </w:pPr>
+      <w:r>
+        <w:rPr>
+          <w:b/>
+          <w:bCs/>
+        </w:rPr>
+        <w:t>52. How can you create a string in Python?</w:t>
+      </w:r>
+    </w:p>
+    <w:p>
+      <w:pPr>
+        <w:ind w:left="360"/>
+      </w:pPr>
+      <w:r>
+        <w:t>By enclosing text in single, double, or triple quotes.</w:t>
+      </w:r>
+    </w:p>
+    <w:p>
+      <w:pPr>
+        <w:ind w:left="360"/>
+      </w:pPr>
+      <w:r>
+        <w:rPr>
+          <w:b/>
+          <w:bCs/>
+        </w:rPr>
+        <w:t>53. What is string indexing?</w:t>
+      </w:r>
+      <w:r>
+        <w:t xml:space="preserve"> </w:t>
+      </w:r>
+    </w:p>
+    <w:p>
+      <w:pPr>
+        <w:ind w:left="360"/>
+      </w:pPr>
+      <w:r>
+        <w:t>Accessing specific characters in a string using their numeric position (starting at 0).</w:t>
+      </w:r>
+    </w:p>
+    <w:p>
+      <w:pPr>
+        <w:ind w:left="360"/>
+      </w:pPr>
+      <w:r>
+        <w:rPr>
+          <w:b/>
+          <w:bCs/>
+        </w:rPr>
+        <w:t>54. What is string slicing?</w:t>
+      </w:r>
+      <w:r>
+        <w:t xml:space="preserve"> </w:t>
+      </w:r>
+    </w:p>
+    <w:p>
+      <w:pPr>
+        <w:ind w:left="360"/>
+      </w:pPr>
+      <w:r>
+        <w:t>Extracting a substring by defining a start and end index.</w:t>
+      </w:r>
+    </w:p>
+    <w:p>
+      <w:pPr>
+        <w:ind w:left="360"/>
+      </w:pPr>
+      <w:r>
+        <w:rPr>
+          <w:b/>
+          <w:bCs/>
+        </w:rPr>
+        <w:t>55. What is negative indexing?</w:t>
+      </w:r>
+      <w:r>
+        <w:t xml:space="preserve"> </w:t>
+      </w:r>
+    </w:p>
+    <w:p>
+      <w:pPr>
+        <w:ind w:left="360"/>
+      </w:pPr>
+      <w:r>
+        <w:t>Accessing characters from the end of the string backward (where -1 is the last character).</w:t>
+      </w:r>
+    </w:p>
+    <w:p>
+      <w:pPr>
+        <w:ind w:left="360"/>
+      </w:pPr>
+      <w:r>
+        <w:rPr>
+          <w:b/>
+          <w:bCs/>
+        </w:rPr>
+        <w:t>56. Are Python strings mutable or immutable?</w:t>
+      </w:r>
+      <w:r>
+        <w:t xml:space="preserve"> </w:t>
+      </w:r>
+    </w:p>
+    <w:p>
+      <w:pPr>
+        <w:ind w:left="360"/>
+      </w:pPr>
+      <w:r>
+        <w:t>They are immutable.</w:t>
+      </w:r>
+    </w:p>
+    <w:p>
+      <w:pPr>
+        <w:ind w:left="360"/>
+      </w:pPr>
+      <w:r>
+        <w:rPr>
+          <w:b/>
+          <w:bCs/>
+        </w:rPr>
+        <w:t>57. What are common string methods?</w:t>
+      </w:r>
+      <w:r>
+        <w:t xml:space="preserve"> </w:t>
+      </w:r>
+    </w:p>
+    <w:p>
+      <w:pPr>
+        <w:ind w:left="360"/>
+      </w:pPr>
+      <w:proofErr w:type="gramStart"/>
+      <w:r>
+        <w:t>lower(</w:t>
+      </w:r>
+      <w:proofErr w:type="gramEnd"/>
+      <w:r>
+        <w:t>), upper(), replace(), split(), join().</w:t>
+      </w:r>
+    </w:p>
+    <w:p>
+      <w:pPr>
+        <w:ind w:left="360"/>
+      </w:pPr>
+      <w:r>
+        <w:rPr>
+          <w:b/>
+          <w:bCs/>
+        </w:rPr>
+        <w:t xml:space="preserve">58. What does the </w:t>
+      </w:r>
+      <w:proofErr w:type="gramStart"/>
+      <w:r>
+        <w:rPr>
+          <w:b/>
+          <w:bCs/>
+        </w:rPr>
+        <w:t>strip(</w:t>
+      </w:r>
+      <w:proofErr w:type="gramEnd"/>
+      <w:r>
+        <w:rPr>
+          <w:b/>
+          <w:bCs/>
+        </w:rPr>
+        <w:t>) function do?</w:t>
+      </w:r>
+      <w:r>
+        <w:t xml:space="preserve"> </w:t>
+      </w:r>
+    </w:p>
+    <w:p>
+      <w:pPr>
+        <w:ind w:left="360"/>
+      </w:pPr>
+      <w:r>
+        <w:t>Removes leading and trailing whitespace.</w:t>
+      </w:r>
+    </w:p>
+    <w:p>
+      <w:pPr>
+        <w:ind w:left="360"/>
+        <w:rPr>
+          <w:b/>
+          <w:bCs/>
+        </w:rPr>
+      </w:pPr>
+      <w:r>
+        <w:rPr>
+          <w:b/>
+          <w:bCs/>
+        </w:rPr>
+        <w:t xml:space="preserve">59. What is the difference between </w:t>
+      </w:r>
+      <w:proofErr w:type="gramStart"/>
+      <w:r>
+        <w:rPr>
+          <w:b/>
+          <w:bCs/>
+        </w:rPr>
+        <w:t>split(</w:t>
+      </w:r>
+      <w:proofErr w:type="gramEnd"/>
+      <w:r>
+        <w:rPr>
+          <w:b/>
+          <w:bCs/>
+        </w:rPr>
+        <w:t>) and join()?</w:t>
+      </w:r>
+    </w:p>
+    <w:p>
+      <w:pPr>
+        <w:ind w:left="360"/>
+      </w:pPr>
+      <w:proofErr w:type="gramStart"/>
+      <w:r>
+        <w:t>split(</w:t>
+      </w:r>
+      <w:proofErr w:type="gramEnd"/>
+      <w:r>
+        <w:t>) breaks a string into a list; join() merges a list of strings into one string.</w:t>
+      </w:r>
+    </w:p>
+    <w:p>
+      <w:pPr>
+        <w:ind w:left="360"/>
+      </w:pPr>
+      <w:r>
+        <w:rPr>
+          <w:b/>
+          <w:bCs/>
+        </w:rPr>
+        <w:t>60. What is string formatting?</w:t>
+      </w:r>
+      <w:r>
+        <w:t xml:space="preserve"> </w:t>
+      </w:r>
+    </w:p>
+    <w:p>
+      <w:pPr>
+        <w:ind w:left="360"/>
+      </w:pPr>
+      <w:r>
+        <w:t>Injecting variables or values into a structured text string.</w:t>
+      </w:r>
+    </w:p>
+    <w:p>
+      <w:pPr>
+        <w:ind w:left="360"/>
+      </w:pPr>
+      <w:r>
+        <w:rPr>
+          <w:b/>
+          <w:bCs/>
+        </w:rPr>
+        <w:t xml:space="preserve">61. What </w:t>
+      </w:r>
+      <w:proofErr w:type="gramStart"/>
+      <w:r>
+        <w:rPr>
+          <w:b/>
+          <w:bCs/>
+        </w:rPr>
+        <w:t>are</w:t>
+      </w:r>
+      <w:proofErr w:type="gramEnd"/>
+      <w:r>
+        <w:rPr>
+          <w:b/>
+          <w:bCs/>
+        </w:rPr>
+        <w:t xml:space="preserve"> f-strings?</w:t>
+      </w:r>
+      <w:r>
+        <w:t xml:space="preserve"> </w:t>
+      </w:r>
+    </w:p>
+    <w:p>
+      <w:pPr>
+        <w:ind w:left="360"/>
+      </w:pPr>
+      <w:r>
+        <w:t>A modern formatting method using the f prefix and {} brackets to evaluate variables directly inside string literals.</w:t>
+      </w:r>
+    </w:p>
+    <w:p>
+      <w:pPr>
+        <w:ind w:left="360"/>
+      </w:pPr>
+      <w:r>
+        <w:rPr>
+          <w:b/>
+          <w:bCs/>
+        </w:rPr>
+        <w:lastRenderedPageBreak/>
+        <w:t xml:space="preserve">62. What is </w:t>
+      </w:r>
+      <w:proofErr w:type="gramStart"/>
+      <w:r>
+        <w:rPr>
+          <w:b/>
+          <w:bCs/>
+        </w:rPr>
+        <w:t>the .format</w:t>
+      </w:r>
+      <w:proofErr w:type="gramEnd"/>
+      <w:r>
+        <w:rPr>
+          <w:b/>
+          <w:bCs/>
+        </w:rPr>
+        <w:t>() method?</w:t>
+      </w:r>
+      <w:r>
+        <w:t xml:space="preserve"> </w:t>
+      </w:r>
+    </w:p>
+    <w:p>
+      <w:pPr>
+        <w:ind w:left="360"/>
+      </w:pPr>
+      <w:r>
+        <w:t xml:space="preserve">An older formatting technique that replaces {} placeholders with arguments passed </w:t>
+      </w:r>
+      <w:proofErr w:type="gramStart"/>
+      <w:r>
+        <w:t>to .format</w:t>
+      </w:r>
+      <w:proofErr w:type="gramEnd"/>
+      <w:r>
+        <w:t>().</w:t>
+      </w:r>
+    </w:p>
+    <w:p>
+      <w:pPr>
+        <w:ind w:left="360"/>
+      </w:pPr>
+      <w:r>
+        <w:rPr>
+          <w:b/>
+          <w:bCs/>
+        </w:rPr>
+        <w:t>63. What are escape characters?</w:t>
+      </w:r>
+      <w:r>
+        <w:t xml:space="preserve"> </w:t>
+      </w:r>
+    </w:p>
+    <w:p>
+      <w:pPr>
+        <w:ind w:left="360"/>
+      </w:pPr>
+      <w:r>
+        <w:t>Special characters prefixed with a backslash \ used to format text or insert illegal characters.</w:t>
+      </w:r>
+    </w:p>
+    <w:p>
+      <w:pPr>
+        <w:ind w:left="360"/>
+      </w:pPr>
+      <w:r>
+        <w:rPr>
+          <w:b/>
+          <w:bCs/>
+        </w:rPr>
+        <w:t>64. What does \n represent?</w:t>
+      </w:r>
+      <w:r>
+        <w:t xml:space="preserve"> </w:t>
+      </w:r>
+    </w:p>
+    <w:p>
+      <w:pPr>
+        <w:ind w:left="360"/>
+      </w:pPr>
+      <w:r>
+        <w:t>A newline.</w:t>
+      </w:r>
+    </w:p>
+    <w:p>
+      <w:pPr>
+        <w:ind w:left="360"/>
+      </w:pPr>
+      <w:r>
+        <w:rPr>
+          <w:b/>
+          <w:bCs/>
+        </w:rPr>
+        <w:t>65. What does \t represent?</w:t>
+      </w:r>
+      <w:r>
+        <w:t xml:space="preserve"> </w:t>
+      </w:r>
+    </w:p>
+    <w:p>
+      <w:pPr>
+        <w:ind w:left="360"/>
+      </w:pPr>
+      <w:r>
+        <w:t>A horizontal tab.</w:t>
+      </w:r>
+    </w:p>
+    <w:p>
+      <w:pPr>
+        <w:rPr>
+          <w:b/>
+          <w:bCs/>
+        </w:rPr>
+      </w:pPr>
+      <w:r>
+        <w:rPr>
+          <w:b/>
+          <w:bCs/>
+        </w:rPr>
+        <w:t>6. Control Flow Statements</w:t>
+      </w:r>
+    </w:p>
+    <w:p>
+      <w:pPr>
+        <w:ind w:left="360"/>
+      </w:pPr>
+      <w:r>
+        <w:rPr>
+          <w:b/>
+          <w:bCs/>
+        </w:rPr>
+        <w:t>66. What are control flow statements?</w:t>
+      </w:r>
+      <w:r>
+        <w:t xml:space="preserve"> </w:t>
+      </w:r>
+    </w:p>
+    <w:p>
+      <w:pPr>
+        <w:ind w:left="360"/>
+      </w:pPr>
+      <w:r>
+        <w:t>Statements that dictate the execution order of code based on logic.</w:t>
+      </w:r>
+    </w:p>
+    <w:p>
+      <w:pPr>
+        <w:ind w:left="360"/>
+      </w:pPr>
+      <w:r>
+        <w:rPr>
+          <w:b/>
+          <w:bCs/>
+        </w:rPr>
+        <w:t>67. What is the syntax of the if statement?</w:t>
+      </w:r>
+      <w:r>
+        <w:t xml:space="preserve"> </w:t>
+      </w:r>
+    </w:p>
+    <w:p>
+      <w:pPr>
+        <w:ind w:left="360"/>
+      </w:pPr>
+      <w:r>
+        <w:t>if condition: followed by an indented block.</w:t>
+      </w:r>
+    </w:p>
+    <w:p>
+      <w:pPr>
+        <w:ind w:left="360"/>
+      </w:pPr>
+      <w:r>
+        <w:rPr>
+          <w:b/>
+          <w:bCs/>
+        </w:rPr>
+        <w:t xml:space="preserve">68. What is the difference between </w:t>
+      </w:r>
+      <w:proofErr w:type="spellStart"/>
+      <w:r>
+        <w:rPr>
+          <w:b/>
+          <w:bCs/>
+        </w:rPr>
+        <w:t>if</w:t>
+      </w:r>
+      <w:proofErr w:type="spellEnd"/>
+      <w:r>
+        <w:rPr>
+          <w:b/>
+          <w:bCs/>
+        </w:rPr>
+        <w:t xml:space="preserve"> and </w:t>
+      </w:r>
+      <w:proofErr w:type="spellStart"/>
+      <w:r>
+        <w:rPr>
+          <w:b/>
+          <w:bCs/>
+        </w:rPr>
+        <w:t>elif</w:t>
+      </w:r>
+      <w:proofErr w:type="spellEnd"/>
+      <w:r>
+        <w:rPr>
+          <w:b/>
+          <w:bCs/>
+        </w:rPr>
+        <w:t>?</w:t>
+      </w:r>
+      <w:r>
+        <w:t xml:space="preserve"> </w:t>
+      </w:r>
+    </w:p>
+    <w:p>
+      <w:pPr>
+        <w:ind w:left="360"/>
+      </w:pPr>
+      <w:r>
+        <w:t>if is the first check</w:t>
+      </w:r>
+      <w:r>
+        <w:t xml:space="preserve"> whereas</w:t>
+      </w:r>
+      <w:r>
+        <w:t xml:space="preserve"> </w:t>
+      </w:r>
+      <w:proofErr w:type="spellStart"/>
+      <w:r>
+        <w:t>elif</w:t>
+      </w:r>
+      <w:proofErr w:type="spellEnd"/>
+      <w:r>
+        <w:t xml:space="preserve"> checks another condition only if the previous checks were false.</w:t>
+      </w:r>
+    </w:p>
+    <w:p>
+      <w:pPr>
+        <w:ind w:left="360"/>
+      </w:pPr>
+      <w:r>
+        <w:rPr>
+          <w:b/>
+          <w:bCs/>
+        </w:rPr>
+        <w:t>69. What is nested if?</w:t>
+      </w:r>
+      <w:r>
+        <w:t xml:space="preserve"> </w:t>
+      </w:r>
+    </w:p>
+    <w:p>
+      <w:pPr>
+        <w:ind w:left="360"/>
+      </w:pPr>
+      <w:r>
+        <w:t>An if statement placed inside another if block.</w:t>
+      </w:r>
+    </w:p>
+    <w:p>
+      <w:pPr>
+        <w:ind w:left="360"/>
+      </w:pPr>
+      <w:r>
+        <w:rPr>
+          <w:b/>
+          <w:bCs/>
+        </w:rPr>
+        <w:t>70. What is the use of else?</w:t>
+      </w:r>
+      <w:r>
+        <w:t xml:space="preserve"> </w:t>
+      </w:r>
+    </w:p>
+    <w:p>
+      <w:pPr>
+        <w:ind w:left="360"/>
+      </w:pPr>
+      <w:r>
+        <w:t xml:space="preserve">It catches any cases where all preceding if and </w:t>
+      </w:r>
+      <w:proofErr w:type="spellStart"/>
+      <w:r>
+        <w:t>elif</w:t>
+      </w:r>
+      <w:proofErr w:type="spellEnd"/>
+      <w:r>
+        <w:t xml:space="preserve"> conditions were false.</w:t>
+      </w:r>
+    </w:p>
+    <w:p>
+      <w:pPr>
+        <w:ind w:left="360"/>
+      </w:pPr>
+      <w:r>
+        <w:rPr>
+          <w:b/>
+          <w:bCs/>
+        </w:rPr>
+        <w:t>71. What is the match-case statement?</w:t>
+      </w:r>
+      <w:r>
+        <w:t xml:space="preserve"> </w:t>
+      </w:r>
+    </w:p>
+    <w:p>
+      <w:pPr>
+        <w:ind w:left="360"/>
+      </w:pPr>
+      <w:r>
+        <w:t>A structural pattern-matching tool similar to switch-case in other languages.</w:t>
+      </w:r>
+    </w:p>
+    <w:p>
+      <w:pPr>
+        <w:ind w:left="360"/>
+      </w:pPr>
+      <w:r>
+        <w:rPr>
+          <w:b/>
+          <w:bCs/>
+        </w:rPr>
+        <w:t>72. In which Python version was match-case introduced?</w:t>
+      </w:r>
+      <w:r>
+        <w:t xml:space="preserve"> </w:t>
+      </w:r>
+    </w:p>
+    <w:p>
+      <w:pPr>
+        <w:ind w:left="360"/>
+      </w:pPr>
+      <w:r>
+        <w:t>Python 3.10.</w:t>
+      </w:r>
+    </w:p>
+    <w:p>
+      <w:pPr>
+        <w:ind w:left="360"/>
+      </w:pPr>
+      <w:r>
+        <w:rPr>
+          <w:b/>
+          <w:bCs/>
+        </w:rPr>
+        <w:t>73. What is the purpose of the pass statement?</w:t>
+      </w:r>
+      <w:r>
+        <w:t xml:space="preserve"> </w:t>
+      </w:r>
+    </w:p>
+    <w:p>
+      <w:pPr>
+        <w:ind w:left="360"/>
+      </w:pPr>
+      <w:r>
+        <w:t>It is a null placeholder that does nothing, used when a block of code is syntactically required but logically empty.</w:t>
+      </w:r>
+    </w:p>
+    <w:p>
+      <w:pPr>
+        <w:ind w:left="360"/>
+      </w:pPr>
+      <w:r>
+        <w:rPr>
+          <w:b/>
+          <w:bCs/>
+        </w:rPr>
+        <w:t>74. What is the difference between break and continue?</w:t>
+      </w:r>
+      <w:r>
+        <w:t xml:space="preserve"> </w:t>
+      </w:r>
+    </w:p>
+    <w:p>
+      <w:pPr>
+        <w:ind w:left="360"/>
+      </w:pPr>
+      <w:r>
+        <w:t>break completely exits the loop; continue skips the rest of the current loop iteration and moves to the next one.</w:t>
+      </w:r>
+    </w:p>
+    <w:p>
+      <w:pPr>
+        <w:ind w:left="360"/>
+      </w:pPr>
+      <w:r>
+        <w:rPr>
+          <w:b/>
+          <w:bCs/>
+        </w:rPr>
+        <w:t>75. What happens when break is used inside a loop?</w:t>
+      </w:r>
+      <w:r>
+        <w:t xml:space="preserve"> </w:t>
+      </w:r>
+    </w:p>
+    <w:p>
+      <w:pPr>
+        <w:ind w:left="360"/>
+      </w:pPr>
+      <w:r>
+        <w:t>The loop immediately terminates.</w:t>
+      </w:r>
+    </w:p>
+    <w:p>
+      <w:pPr>
+        <w:ind w:left="360"/>
+      </w:pPr>
+      <w:r>
+        <w:rPr>
+          <w:b/>
+          <w:bCs/>
+        </w:rPr>
+        <w:t>76. What happens when continue is used inside a loop?</w:t>
+      </w:r>
+      <w:r>
+        <w:t xml:space="preserve"> </w:t>
+      </w:r>
+    </w:p>
+    <w:p>
+      <w:pPr>
+        <w:ind w:left="360"/>
+      </w:pPr>
+      <w:r>
+        <w:t>The code skips to the top of the loop for the next cycle.</w:t>
+      </w:r>
+    </w:p>
+    <w:p>
+      <w:pPr>
+        <w:ind w:left="360"/>
+        <w:rPr>
+          <w:b/>
+          <w:bCs/>
+        </w:rPr>
+      </w:pPr>
+    </w:p>
+    <w:p>
+      <w:pPr>
+        <w:ind w:left="360"/>
+        <w:rPr>
+          <w:b/>
+          <w:bCs/>
+        </w:rPr>
+      </w:pPr>
+    </w:p>
+    <w:p>
+      <w:pPr>
+        <w:ind w:left="360"/>
+      </w:pPr>
+      <w:r>
+        <w:rPr>
+          <w:b/>
+          <w:bCs/>
+        </w:rPr>
+        <w:lastRenderedPageBreak/>
+        <w:t>77. What is short-circuit evaluation?</w:t>
+      </w:r>
+      <w:r>
+        <w:t xml:space="preserve"> </w:t>
+      </w:r>
+    </w:p>
+    <w:p>
+      <w:pPr>
+        <w:ind w:left="360"/>
+      </w:pPr>
+      <w:r>
+        <w:t>When Python stops evaluating a logical statement early because the result is already guaranteed (e.g., encountering False in an and statement).</w:t>
+      </w:r>
+    </w:p>
+    <w:p>
+      <w:pPr>
+        <w:ind w:left="360"/>
+      </w:pPr>
+      <w:r>
+        <w:rPr>
+          <w:b/>
+          <w:bCs/>
+        </w:rPr>
+        <w:t>78. How can you write multiple conditions in an if statement?</w:t>
+      </w:r>
+      <w:r>
+        <w:t xml:space="preserve"> </w:t>
+      </w:r>
+    </w:p>
+    <w:p>
+      <w:pPr>
+        <w:ind w:left="360"/>
+      </w:pPr>
+      <w:r>
+        <w:t xml:space="preserve">By chaining them using and </w:t>
+      </w:r>
+      <w:proofErr w:type="spellStart"/>
+      <w:r>
+        <w:t>and</w:t>
+      </w:r>
+      <w:proofErr w:type="spellEnd"/>
+      <w:r>
+        <w:t xml:space="preserve"> or.</w:t>
+      </w:r>
+    </w:p>
+    <w:p>
+      <w:pPr>
+        <w:ind w:left="360"/>
+      </w:pPr>
+      <w:r>
+        <w:rPr>
+          <w:b/>
+          <w:bCs/>
+        </w:rPr>
+        <w:t>79. What is the ternary operator in Python?</w:t>
+      </w:r>
+      <w:r>
+        <w:t xml:space="preserve"> </w:t>
+      </w:r>
+    </w:p>
+    <w:p>
+      <w:pPr>
+        <w:ind w:left="360"/>
+      </w:pPr>
+      <w:r>
+        <w:t xml:space="preserve">A one-line if-else statement: </w:t>
+      </w:r>
+      <w:proofErr w:type="spellStart"/>
+      <w:r>
+        <w:t>value_if_true</w:t>
+      </w:r>
+      <w:proofErr w:type="spellEnd"/>
+      <w:r>
+        <w:t xml:space="preserve"> if condition else </w:t>
+      </w:r>
+      <w:proofErr w:type="spellStart"/>
+      <w:r>
+        <w:t>value_if_false</w:t>
+      </w:r>
+      <w:proofErr w:type="spellEnd"/>
+      <w:r>
+        <w:t>.</w:t>
+      </w:r>
+    </w:p>
+    <w:p>
+      <w:pPr>
+        <w:ind w:left="360"/>
+        <w:rPr>
+          <w:b/>
+          <w:bCs/>
+        </w:rPr>
+      </w:pPr>
+      <w:r>
+        <w:rPr>
+          <w:b/>
+          <w:bCs/>
+        </w:rPr>
+        <w:t>80. How do you check whether a number is positive or negative?</w:t>
+      </w:r>
+    </w:p>
+    <w:p>
+      <w:pPr>
+        <w:ind w:left="360"/>
+      </w:pPr>
+      <w:r>
+        <w:t xml:space="preserve"> By checking if </w:t>
+      </w:r>
+      <w:proofErr w:type="spellStart"/>
+      <w:r>
+        <w:t>num</w:t>
+      </w:r>
+      <w:proofErr w:type="spellEnd"/>
+      <w:r>
+        <w:t xml:space="preserve"> &gt; 0: for positive and </w:t>
+      </w:r>
+      <w:proofErr w:type="spellStart"/>
+      <w:r>
+        <w:t>elif</w:t>
+      </w:r>
+      <w:proofErr w:type="spellEnd"/>
+      <w:r>
+        <w:t xml:space="preserve"> </w:t>
+      </w:r>
+      <w:proofErr w:type="spellStart"/>
+      <w:r>
+        <w:t>num</w:t>
+      </w:r>
+      <w:proofErr w:type="spellEnd"/>
+      <w:r>
+        <w:t xml:space="preserve"> &lt; 0: for negative.</w:t>
+      </w:r>
+    </w:p>
+    <w:p>
+      <w:pPr>
+        <w:rPr>
+          <w:b/>
+          <w:bCs/>
+        </w:rPr>
+      </w:pPr>
+      <w:r>
+        <w:rPr>
+          <w:b/>
+          <w:bCs/>
+        </w:rPr>
+        <w:t>7. Loops</w:t>
+      </w:r>
+    </w:p>
+    <w:p>
+      <w:pPr>
+        <w:ind w:left="360"/>
+      </w:pPr>
+      <w:r>
+        <w:rPr>
+          <w:b/>
+          <w:bCs/>
+        </w:rPr>
+        <w:t>81. What is a loop in programming?</w:t>
+      </w:r>
+      <w:r>
+        <w:t xml:space="preserve"> </w:t>
+      </w:r>
+    </w:p>
+    <w:p>
+      <w:pPr>
+        <w:ind w:left="360"/>
+      </w:pPr>
+      <w:r>
+        <w:t>A structure that repeats a block of code multiple times.</w:t>
+      </w:r>
+    </w:p>
+    <w:p>
+      <w:pPr>
+        <w:ind w:left="360"/>
+      </w:pPr>
+      <w:r>
+        <w:rPr>
+          <w:b/>
+          <w:bCs/>
+        </w:rPr>
+        <w:t>82. What is the difference between for loop and while loop?</w:t>
+      </w:r>
+      <w:r>
+        <w:t xml:space="preserve"> </w:t>
+      </w:r>
+    </w:p>
+    <w:p>
+      <w:pPr>
+        <w:ind w:left="360"/>
+      </w:pPr>
+      <w:r>
+        <w:t>A for loop iterates over a known sequence; a while loop iterates infinitely until a condition becomes false.</w:t>
+      </w:r>
+    </w:p>
+    <w:p>
+      <w:pPr>
+        <w:ind w:left="360"/>
+      </w:pPr>
+      <w:r>
+        <w:rPr>
+          <w:b/>
+          <w:bCs/>
+        </w:rPr>
+        <w:t>83. How does a for loop work in Python?</w:t>
+      </w:r>
+      <w:r>
+        <w:t xml:space="preserve"> </w:t>
+      </w:r>
+    </w:p>
+    <w:p>
+      <w:pPr>
+        <w:ind w:left="360"/>
+      </w:pPr>
+      <w:r>
+        <w:t xml:space="preserve">It sequentially grabs items from an </w:t>
+      </w:r>
+      <w:proofErr w:type="spellStart"/>
+      <w:r>
+        <w:t>iterable</w:t>
+      </w:r>
+      <w:proofErr w:type="spellEnd"/>
+      <w:r>
+        <w:t xml:space="preserve"> object (like a list or range) and executes the block for each item.</w:t>
+      </w:r>
+    </w:p>
+    <w:p>
+      <w:pPr>
+        <w:ind w:left="360"/>
+      </w:pPr>
+      <w:r>
+        <w:rPr>
+          <w:b/>
+          <w:bCs/>
+        </w:rPr>
+        <w:t>84. How does a while loop work?</w:t>
+      </w:r>
+      <w:r>
+        <w:t xml:space="preserve"> </w:t>
+      </w:r>
+    </w:p>
+    <w:p>
+      <w:pPr>
+        <w:ind w:left="360"/>
+      </w:pPr>
+      <w:r>
+        <w:t xml:space="preserve">It evaluates a </w:t>
+      </w:r>
+      <w:proofErr w:type="spellStart"/>
+      <w:r>
+        <w:t>boolean</w:t>
+      </w:r>
+      <w:proofErr w:type="spellEnd"/>
+      <w:r>
+        <w:t xml:space="preserve"> condition before every iteration and runs the block as long as the condition is True.</w:t>
+      </w:r>
+    </w:p>
+    <w:p>
+      <w:pPr>
+        <w:ind w:left="360"/>
+      </w:pPr>
+      <w:r>
+        <w:rPr>
+          <w:b/>
+          <w:bCs/>
+        </w:rPr>
+        <w:t>85. What is an infinite loop?</w:t>
+      </w:r>
+      <w:r>
+        <w:t xml:space="preserve"> </w:t>
+      </w:r>
+    </w:p>
+    <w:p>
+      <w:pPr>
+        <w:ind w:left="360"/>
+      </w:pPr>
+      <w:r>
+        <w:t>A loop where the exit condition is structurally impossible to reach, causing it to run forever.</w:t>
+      </w:r>
+    </w:p>
+    <w:p>
+      <w:pPr>
+        <w:ind w:left="360"/>
+      </w:pPr>
+      <w:r>
+        <w:rPr>
+          <w:b/>
+          <w:bCs/>
+        </w:rPr>
+        <w:t xml:space="preserve">86. What is the </w:t>
+      </w:r>
+      <w:proofErr w:type="gramStart"/>
+      <w:r>
+        <w:rPr>
+          <w:b/>
+          <w:bCs/>
+        </w:rPr>
+        <w:t>range(</w:t>
+      </w:r>
+      <w:proofErr w:type="gramEnd"/>
+      <w:r>
+        <w:rPr>
+          <w:b/>
+          <w:bCs/>
+        </w:rPr>
+        <w:t>) function?</w:t>
+      </w:r>
+      <w:r>
+        <w:t xml:space="preserve"> </w:t>
+      </w:r>
+    </w:p>
+    <w:p>
+      <w:pPr>
+        <w:ind w:left="360"/>
+      </w:pPr>
+      <w:r>
+        <w:t>A built-in function that generates a sequence of numbers.</w:t>
+      </w:r>
+    </w:p>
+    <w:p>
+      <w:pPr>
+        <w:ind w:left="360"/>
+      </w:pPr>
+      <w:r>
+        <w:rPr>
+          <w:b/>
+          <w:bCs/>
+        </w:rPr>
+        <w:t xml:space="preserve">87. What are the parameters of </w:t>
+      </w:r>
+      <w:proofErr w:type="gramStart"/>
+      <w:r>
+        <w:rPr>
+          <w:b/>
+          <w:bCs/>
+        </w:rPr>
+        <w:t>range(</w:t>
+      </w:r>
+      <w:proofErr w:type="gramEnd"/>
+      <w:r>
+        <w:rPr>
+          <w:b/>
+          <w:bCs/>
+        </w:rPr>
+        <w:t>)?</w:t>
+      </w:r>
+      <w:r>
+        <w:t xml:space="preserve"> </w:t>
+      </w:r>
+    </w:p>
+    <w:p>
+      <w:pPr>
+        <w:ind w:left="360"/>
+      </w:pPr>
+      <w:r>
+        <w:t>start (inclusive), stop (exclusive), and step.</w:t>
+      </w:r>
+    </w:p>
+    <w:p>
+      <w:pPr>
+        <w:ind w:left="360"/>
+      </w:pPr>
+      <w:r>
+        <w:rPr>
+          <w:b/>
+          <w:bCs/>
+        </w:rPr>
+        <w:t>88. What is a nested loop?</w:t>
+      </w:r>
+      <w:r>
+        <w:t xml:space="preserve"> </w:t>
+      </w:r>
+    </w:p>
+    <w:p>
+      <w:pPr>
+        <w:ind w:left="360"/>
+      </w:pPr>
+      <w:r>
+        <w:t>A loop placed entirely inside the body of another loop.</w:t>
+      </w:r>
+    </w:p>
+    <w:p>
+      <w:pPr>
+        <w:ind w:left="360"/>
+      </w:pPr>
+      <w:r>
+        <w:rPr>
+          <w:b/>
+          <w:bCs/>
+        </w:rPr>
+        <w:t>89. What is loop control?</w:t>
+      </w:r>
+      <w:r>
+        <w:t xml:space="preserve"> </w:t>
+      </w:r>
+    </w:p>
+    <w:p>
+      <w:pPr>
+        <w:ind w:left="360"/>
+      </w:pPr>
+      <w:r>
+        <w:t>Using statements like break or continue to manipulate the standard flow of a loop.</w:t>
+      </w:r>
+    </w:p>
+    <w:p>
+      <w:pPr>
+        <w:ind w:left="360"/>
+      </w:pPr>
+      <w:r>
+        <w:rPr>
+          <w:b/>
+          <w:bCs/>
+        </w:rPr>
+        <w:t>90. What does the break statement do?</w:t>
+      </w:r>
+      <w:r>
+        <w:t xml:space="preserve"> </w:t>
+      </w:r>
+    </w:p>
+    <w:p>
+      <w:pPr>
+        <w:ind w:left="360"/>
+      </w:pPr>
+      <w:r>
+        <w:t>Instantly aborts the loop.</w:t>
+      </w:r>
+    </w:p>
+    <w:p>
+      <w:pPr>
+        <w:ind w:left="360"/>
+      </w:pPr>
+      <w:r>
+        <w:rPr>
+          <w:b/>
+          <w:bCs/>
+        </w:rPr>
+        <w:t>91. What does the continue statement do?</w:t>
+      </w:r>
+      <w:r>
+        <w:t xml:space="preserve"> </w:t>
+      </w:r>
+    </w:p>
+    <w:p>
+      <w:pPr>
+        <w:ind w:left="360"/>
+      </w:pPr>
+      <w:r>
+        <w:t>Skips the remaining code in the loop body and starts the next iteration.</w:t>
+      </w:r>
+    </w:p>
+    <w:p>
+      <w:pPr>
+        <w:ind w:left="360"/>
+        <w:rPr>
+          <w:b/>
+          <w:bCs/>
+        </w:rPr>
+      </w:pPr>
+      <w:r>
+        <w:rPr>
+          <w:b/>
+          <w:bCs/>
+        </w:rPr>
+        <w:t>92. What does the else block in loops do?</w:t>
+      </w:r>
+    </w:p>
+    <w:p>
+      <w:pPr>
+        <w:ind w:left="360"/>
+      </w:pPr>
+      <w:r>
+        <w:t xml:space="preserve"> It executes only if the loop finishes its iterations completely naturally (i.e., it was never interrupted by a break statement).</w:t>
+      </w:r>
+    </w:p>
+    <w:p>
+      <w:pPr>
+        <w:ind w:left="360"/>
+      </w:pPr>
+      <w:r>
+        <w:rPr>
+          <w:b/>
+          <w:bCs/>
+        </w:rPr>
+        <w:lastRenderedPageBreak/>
+        <w:t>93. How do you iterate over a string using a loop?</w:t>
+      </w:r>
+      <w:r>
+        <w:t xml:space="preserve"> </w:t>
+      </w:r>
+    </w:p>
+    <w:p>
+      <w:pPr>
+        <w:ind w:left="360"/>
+      </w:pPr>
+      <w:r>
+        <w:t>By using a for loop: for character in "string":</w:t>
+      </w:r>
+    </w:p>
+    <w:p>
+      <w:pPr>
+        <w:ind w:left="360"/>
+      </w:pPr>
+      <w:r>
+        <w:rPr>
+          <w:b/>
+          <w:bCs/>
+        </w:rPr>
+        <w:t>94. How do you iterate over a list using a loop?</w:t>
+      </w:r>
+      <w:r>
+        <w:t xml:space="preserve"> </w:t>
+      </w:r>
+    </w:p>
+    <w:p>
+      <w:pPr>
+        <w:ind w:left="360"/>
+      </w:pPr>
+      <w:r>
+        <w:t xml:space="preserve">By using a for loop: for item in </w:t>
+      </w:r>
+      <w:proofErr w:type="spellStart"/>
+      <w:r>
+        <w:t>my_list</w:t>
+      </w:r>
+      <w:proofErr w:type="spellEnd"/>
+      <w:r>
+        <w:t>:</w:t>
+      </w:r>
+    </w:p>
+    <w:p>
+      <w:pPr>
+        <w:ind w:left="360"/>
+      </w:pPr>
+      <w:r>
+        <w:rPr>
+          <w:b/>
+          <w:bCs/>
+        </w:rPr>
+        <w:t xml:space="preserve">95. How do you reverse a loop using </w:t>
+      </w:r>
+      <w:proofErr w:type="gramStart"/>
+      <w:r>
+        <w:rPr>
+          <w:b/>
+          <w:bCs/>
+        </w:rPr>
+        <w:t>range(</w:t>
+      </w:r>
+      <w:proofErr w:type="gramEnd"/>
+      <w:r>
+        <w:rPr>
+          <w:b/>
+          <w:bCs/>
+        </w:rPr>
+        <w:t>)?</w:t>
+      </w:r>
+      <w:r>
+        <w:t xml:space="preserve"> </w:t>
+      </w:r>
+    </w:p>
+    <w:p>
+      <w:pPr>
+        <w:ind w:left="360"/>
+      </w:pPr>
+      <w:r>
+        <w:t xml:space="preserve">By passing a negative step parameter: </w:t>
+      </w:r>
+      <w:proofErr w:type="gramStart"/>
+      <w:r>
+        <w:t>range(</w:t>
+      </w:r>
+      <w:proofErr w:type="gramEnd"/>
+      <w:r>
+        <w:t>10, 0, -1).</w:t>
+      </w:r>
+    </w:p>
+    <w:p>
+      <w:pPr>
+        <w:ind w:left="360"/>
+        <w:rPr>
+          <w:b/>
+          <w:bCs/>
+        </w:rPr>
+      </w:pPr>
+      <w:r>
+        <w:rPr>
+          <w:b/>
+          <w:bCs/>
+        </w:rPr>
+        <w:t xml:space="preserve">96. </w:t>
+      </w:r>
+      <w:proofErr w:type="gramStart"/>
+      <w:r>
+        <w:rPr>
+          <w:b/>
+          <w:bCs/>
+        </w:rPr>
+        <w:t>print(</w:t>
+      </w:r>
+      <w:proofErr w:type="gramEnd"/>
+      <w:r>
+        <w:rPr>
+          <w:b/>
+          <w:bCs/>
+        </w:rPr>
+        <w:t>True + True)</w:t>
+      </w:r>
+    </w:p>
+    <w:p>
+      <w:pPr>
+        <w:ind w:left="360" w:firstLine="360"/>
+        <w:rPr>
+          <w:b/>
+          <w:bCs/>
+        </w:rPr>
+      </w:pPr>
+      <w:r>
+        <w:rPr>
+          <w:b/>
+          <w:bCs/>
+        </w:rPr>
+        <w:t>Output</w:t>
+      </w:r>
+    </w:p>
+    <w:p>
+      <w:pPr>
+        <w:ind w:left="360" w:firstLine="360"/>
+      </w:pPr>
+      <w:r>
+        <w:t>2</w:t>
+      </w:r>
+    </w:p>
+    <w:p>
+      <w:pPr>
+        <w:ind w:left="360"/>
+        <w:rPr>
+          <w:b/>
+          <w:bCs/>
+        </w:rPr>
+      </w:pPr>
+      <w:r>
+        <w:rPr>
+          <w:b/>
+          <w:bCs/>
+        </w:rPr>
+        <w:t>97. a = [1, 2, 3]</w:t>
+      </w:r>
+    </w:p>
+    <w:p>
+      <w:pPr>
+        <w:ind w:left="360"/>
+        <w:rPr>
+          <w:b/>
+          <w:bCs/>
+        </w:rPr>
+      </w:pPr>
+      <w:r>
+        <w:rPr>
+          <w:b/>
+          <w:bCs/>
+        </w:rPr>
+        <w:tab/>
+        <w:t>b = a</w:t>
+      </w:r>
+    </w:p>
+    <w:p>
+      <w:pPr>
+        <w:ind w:left="360"/>
+        <w:rPr>
+          <w:b/>
+          <w:bCs/>
+        </w:rPr>
+      </w:pPr>
+      <w:r>
+        <w:rPr>
+          <w:b/>
+          <w:bCs/>
+        </w:rPr>
+        <w:tab/>
+      </w:r>
+      <w:proofErr w:type="spellStart"/>
+      <w:proofErr w:type="gramStart"/>
+      <w:r>
+        <w:rPr>
+          <w:b/>
+          <w:bCs/>
+        </w:rPr>
+        <w:t>b.append</w:t>
+      </w:r>
+      <w:proofErr w:type="spellEnd"/>
+      <w:proofErr w:type="gramEnd"/>
+      <w:r>
+        <w:rPr>
+          <w:b/>
+          <w:bCs/>
+        </w:rPr>
+        <w:t xml:space="preserve"> (4)</w:t>
+      </w:r>
+    </w:p>
+    <w:p>
+      <w:pPr>
+        <w:ind w:left="360"/>
+        <w:rPr>
+          <w:b/>
+          <w:bCs/>
+        </w:rPr>
+      </w:pPr>
+      <w:r>
+        <w:rPr>
+          <w:b/>
+          <w:bCs/>
+        </w:rPr>
+        <w:tab/>
+        <w:t>print(a)</w:t>
+      </w:r>
+    </w:p>
+    <w:p>
+      <w:pPr>
+        <w:tabs>
+          <w:tab w:val="left" w:pos="720"/>
+          <w:tab w:val="left" w:pos="1440"/>
+          <w:tab w:val="left" w:pos="2208"/>
+        </w:tabs>
+        <w:ind w:left="360"/>
+        <w:rPr>
+          <w:b/>
+          <w:bCs/>
+        </w:rPr>
+      </w:pPr>
+      <w:r>
+        <w:rPr>
+          <w:b/>
+          <w:bCs/>
+        </w:rPr>
+        <w:tab/>
+        <w:t>Output</w:t>
+      </w:r>
+    </w:p>
+    <w:p>
+      <w:pPr>
+        <w:ind w:left="360"/>
+      </w:pPr>
+      <w:r>
+        <w:rPr>
+          <w:b/>
+          <w:bCs/>
+        </w:rPr>
+        <w:tab/>
+      </w:r>
+      <w:r>
+        <w:t>[1, 2, 3, 4]</w:t>
+      </w:r>
+    </w:p>
+    <w:p>
+      <w:pPr>
+        <w:ind w:left="360"/>
+        <w:rPr>
+          <w:b/>
+          <w:bCs/>
+        </w:rPr>
+      </w:pPr>
+      <w:r>
+        <w:rPr>
+          <w:b/>
+          <w:bCs/>
+        </w:rPr>
+        <w:t xml:space="preserve">98. </w:t>
+      </w:r>
+      <w:proofErr w:type="gramStart"/>
+      <w:r>
+        <w:rPr>
+          <w:b/>
+          <w:bCs/>
+        </w:rPr>
+        <w:t>print( bool</w:t>
+      </w:r>
+      <w:proofErr w:type="gramEnd"/>
+      <w:r>
+        <w:rPr>
+          <w:b/>
+          <w:bCs/>
+        </w:rPr>
+        <w:t xml:space="preserve"> (“ ”) )</w:t>
+      </w:r>
+    </w:p>
+    <w:p>
+      <w:pPr>
+        <w:ind w:left="360"/>
+        <w:rPr>
+          <w:b/>
+          <w:bCs/>
+        </w:rPr>
+      </w:pPr>
+      <w:r>
+        <w:rPr>
+          <w:b/>
+          <w:bCs/>
+        </w:rPr>
+        <w:tab/>
+        <w:t>Output</w:t>
+      </w:r>
+    </w:p>
+    <w:p>
+      <w:pPr>
+        <w:ind w:left="360"/>
+      </w:pPr>
+      <w:r>
+        <w:rPr>
+          <w:b/>
+          <w:bCs/>
+        </w:rPr>
+        <w:tab/>
+      </w:r>
+      <w:r>
+        <w:t>False</w:t>
+      </w:r>
+    </w:p>
+    <w:p>
+      <w:pPr>
+        <w:ind w:left="360"/>
+        <w:rPr>
+          <w:b/>
+          <w:bCs/>
+        </w:rPr>
+      </w:pPr>
+      <w:r>
+        <w:rPr>
+          <w:b/>
+          <w:bCs/>
+        </w:rPr>
+        <w:t xml:space="preserve">99. </w:t>
+      </w:r>
+      <w:proofErr w:type="gramStart"/>
+      <w:r>
+        <w:rPr>
+          <w:b/>
+          <w:bCs/>
+        </w:rPr>
+        <w:t>print(</w:t>
+      </w:r>
+      <w:proofErr w:type="gramEnd"/>
+      <w:r>
+        <w:rPr>
+          <w:b/>
+          <w:bCs/>
+        </w:rPr>
+        <w:t>type (None))</w:t>
+      </w:r>
+    </w:p>
+    <w:p>
+      <w:pPr>
+        <w:ind w:left="360"/>
+        <w:rPr>
+          <w:b/>
+          <w:bCs/>
+        </w:rPr>
+      </w:pPr>
+      <w:r>
+        <w:rPr>
+          <w:b/>
+          <w:bCs/>
+        </w:rPr>
+        <w:tab/>
+        <w:t>Output</w:t>
+      </w:r>
+    </w:p>
+    <w:p>
+      <w:pPr>
+        <w:ind w:left="360"/>
+      </w:pPr>
+      <w:r>
+        <w:rPr>
+          <w:b/>
+          <w:bCs/>
+        </w:rPr>
+        <w:tab/>
+      </w:r>
+      <w:r>
+        <w:t>&lt;class '</w:t>
+      </w:r>
+      <w:proofErr w:type="spellStart"/>
+      <w:r>
+        <w:t>NoneType</w:t>
+      </w:r>
+      <w:proofErr w:type="spellEnd"/>
+      <w:r>
+        <w:t>'&gt;</w:t>
+      </w:r>
+    </w:p>
+    <w:p>
+      <w:pPr>
+        <w:ind w:left="360"/>
+        <w:rPr>
+          <w:b/>
+          <w:bCs/>
+        </w:rPr>
+      </w:pPr>
+      <w:r>
+        <w:rPr>
+          <w:b/>
+          <w:bCs/>
+        </w:rPr>
+        <w:t xml:space="preserve">100. </w:t>
+      </w:r>
+      <w:proofErr w:type="gramStart"/>
+      <w:r>
+        <w:rPr>
+          <w:b/>
+          <w:bCs/>
+        </w:rPr>
+        <w:t>print( 5</w:t>
+      </w:r>
+      <w:proofErr w:type="gramEnd"/>
+      <w:r>
+        <w:rPr>
+          <w:b/>
+          <w:bCs/>
+        </w:rPr>
+        <w:t xml:space="preserve"> == 5.0)</w:t>
+      </w:r>
+    </w:p>
+    <w:p>
+      <w:pPr>
+        <w:ind w:left="360"/>
+        <w:rPr>
+          <w:b/>
+          <w:bCs/>
+        </w:rPr>
+      </w:pPr>
+      <w:r>
+        <w:rPr>
+          <w:b/>
+          <w:bCs/>
+        </w:rPr>
+        <w:tab/>
+        <w:t>Output</w:t>
+      </w:r>
+    </w:p>
+    <w:p>
+      <w:pPr>
+        <w:ind w:left="360"/>
+      </w:pPr>
+      <w:r>
+        <w:rPr>
+          <w:b/>
+          <w:bCs/>
+        </w:rPr>
+        <w:tab/>
+      </w:r>
+      <w:r>
+        <w:t>True</w:t>
+      </w:r>
     </w:p>
     <w:sectPr>
       <w:pgSz w:w="11906" w:h="16838"/>
@@ -626,6 +3199,304 @@
 <file path=word/numbering.xml><?xml version="1.0" encoding="utf-8"?>
 <w:numbering xmlns:wpc="http://schemas.microsoft.com/office/word/2010/wordprocessingCanvas" xmlns:cx="http://schemas.microsoft.com/office/drawing/2014/chartex" xmlns:cx1="http://schemas.microsoft.com/office/drawing/2015/9/8/chartex" xmlns:cx2="http://schemas.microsoft.com/office/drawing/2015/10/21/chartex" xmlns:cx3="http://schemas.microsoft.com/office/drawing/2016/5/9/chartex" xmlns:cx4="http://schemas.microsoft.com/office/drawing/2016/5/10/chartex" xmlns:cx5="http://schemas.microsoft.com/office/drawing/2016/5/11/chartex" xmlns:cx6="http://schemas.microsoft.com/office/drawing/2016/5/12/chartex" xmlns:cx7="http://schemas.microsoft.com/office/drawing/2016/5/13/chartex" xmlns:cx8="http://schemas.microsoft.com/office/drawing/2016/5/14/chartex" xmlns:mc="http://schemas.openxmlformats.org/markup-compatibility/2006" xmlns:aink="http://schemas.microsoft.com/office/drawing/2016/ink" xmlns:am3d="http://schemas.microsoft.com/office/drawing/2017/model3d" xmlns:o="urn:schemas-microsoft-com:office:office" xmlns:oel="http://schemas.microsoft.com/office/2019/extlst" xmlns:r="http://schemas.openxmlformats.org/officeDocument/2006/relationships" xmlns:m="http://schemas.openxmlformats.org/officeDocument/2006/math" xmlns:v="urn:schemas-microsoft-com:vml" xmlns:wp14="http://schemas.microsoft.com/office/word/2010/wordprocessingDrawing" xmlns:wp="http://schemas.openxmlformats.org/drawingml/2006/wordprocessingDrawing" xmlns:w10="urn:schemas-microsoft-com:office:word" xmlns:w="http://schemas.openxmlformats.org/wordprocessingml/2006/main" xmlns:w14="http://schemas.microsoft.com/office/word/2010/wordml" xmlns:w15="http://schemas.microsoft.com/office/word/2012/wordml" xmlns:w16cex="http://schemas.microsoft.com/office/word/2018/wordml/cex" xmlns:w16cid="http://schemas.microsoft.com/office/word/2016/wordml/cid" xmlns:w16="http://schemas.microsoft.com/office/word/2018/wordml" xmlns:w16sdtdh="http://schemas.microsoft.com/office/word/2020/wordml/sdtdatahash" xmlns:w16se="http://schemas.microsoft.com/office/word/2015/wordml/symex" xmlns:wpg="http://schemas.microsoft.com/office/word/2010/wordprocessingGroup" xmlns:wpi="http://schemas.microsoft.com/office/word/2010/wordprocessingInk" xmlns:wne="http://schemas.microsoft.com/office/word/2006/wordml" xmlns:wps="http://schemas.microsoft.com/office/word/2010/wordprocessingShape" mc:Ignorable="w14 w15 w16se w16cid w16 w16cex w16sdtdh wp14">
   <w:abstractNum w:abstractNumId="0" w15:restartNumberingAfterBreak="0">
+    <w:nsid w:val="093C042F"/>
+    <w:multiLevelType w:val="multilevel"/>
+    <w:tmpl w:val="6976601A"/>
+    <w:lvl w:ilvl="0">
+      <w:start w:val="1"/>
+      <w:numFmt w:val="bullet"/>
+      <w:lvlText w:val=""/>
+      <w:lvlJc w:val="left"/>
+      <w:pPr>
+        <w:tabs>
+          <w:tab w:val="num" w:pos="720"/>
+        </w:tabs>
+        <w:ind w:left="720" w:hanging="360"/>
+      </w:pPr>
+      <w:rPr>
+        <w:rFonts w:ascii="Symbol" w:hAnsi="Symbol" w:hint="default"/>
+        <w:sz w:val="20"/>
+      </w:rPr>
+    </w:lvl>
+    <w:lvl w:ilvl="1" w:tentative="1">
+      <w:start w:val="1"/>
+      <w:numFmt w:val="bullet"/>
+      <w:lvlText w:val="o"/>
+      <w:lvlJc w:val="left"/>
+      <w:pPr>
+        <w:tabs>
+          <w:tab w:val="num" w:pos="1440"/>
+        </w:tabs>
+        <w:ind w:left="1440" w:hanging="360"/>
+      </w:pPr>
+      <w:rPr>
+        <w:rFonts w:ascii="Courier New" w:hAnsi="Courier New" w:hint="default"/>
+        <w:sz w:val="20"/>
+      </w:rPr>
+    </w:lvl>
+    <w:lvl w:ilvl="2" w:tentative="1">
+      <w:start w:val="1"/>
+      <w:numFmt w:val="bullet"/>
+      <w:lvlText w:val=""/>
+      <w:lvlJc w:val="left"/>
+      <w:pPr>
+        <w:tabs>
+          <w:tab w:val="num" w:pos="2160"/>
+        </w:tabs>
+        <w:ind w:left="2160" w:hanging="360"/>
+      </w:pPr>
+      <w:rPr>
+        <w:rFonts w:ascii="Wingdings" w:hAnsi="Wingdings" w:hint="default"/>
+        <w:sz w:val="20"/>
+      </w:rPr>
+    </w:lvl>
+    <w:lvl w:ilvl="3" w:tentative="1">
+      <w:start w:val="1"/>
+      <w:numFmt w:val="bullet"/>
+      <w:lvlText w:val=""/>
+      <w:lvlJc w:val="left"/>
+      <w:pPr>
+        <w:tabs>
+          <w:tab w:val="num" w:pos="2880"/>
+        </w:tabs>
+        <w:ind w:left="2880" w:hanging="360"/>
+      </w:pPr>
+      <w:rPr>
+        <w:rFonts w:ascii="Wingdings" w:hAnsi="Wingdings" w:hint="default"/>
+        <w:sz w:val="20"/>
+      </w:rPr>
+    </w:lvl>
+    <w:lvl w:ilvl="4" w:tentative="1">
+      <w:start w:val="1"/>
+      <w:numFmt w:val="bullet"/>
+      <w:lvlText w:val=""/>
+      <w:lvlJc w:val="left"/>
+      <w:pPr>
+        <w:tabs>
+          <w:tab w:val="num" w:pos="3600"/>
+        </w:tabs>
+        <w:ind w:left="3600" w:hanging="360"/>
+      </w:pPr>
+      <w:rPr>
+        <w:rFonts w:ascii="Wingdings" w:hAnsi="Wingdings" w:hint="default"/>
+        <w:sz w:val="20"/>
+      </w:rPr>
+    </w:lvl>
+    <w:lvl w:ilvl="5" w:tentative="1">
+      <w:start w:val="1"/>
+      <w:numFmt w:val="bullet"/>
+      <w:lvlText w:val=""/>
+      <w:lvlJc w:val="left"/>
+      <w:pPr>
+        <w:tabs>
+          <w:tab w:val="num" w:pos="4320"/>
+        </w:tabs>
+        <w:ind w:left="4320" w:hanging="360"/>
+      </w:pPr>
+      <w:rPr>
+        <w:rFonts w:ascii="Wingdings" w:hAnsi="Wingdings" w:hint="default"/>
+        <w:sz w:val="20"/>
+      </w:rPr>
+    </w:lvl>
+    <w:lvl w:ilvl="6" w:tentative="1">
+      <w:start w:val="1"/>
+      <w:numFmt w:val="bullet"/>
+      <w:lvlText w:val=""/>
+      <w:lvlJc w:val="left"/>
+      <w:pPr>
+        <w:tabs>
+          <w:tab w:val="num" w:pos="5040"/>
+        </w:tabs>
+        <w:ind w:left="5040" w:hanging="360"/>
+      </w:pPr>
+      <w:rPr>
+        <w:rFonts w:ascii="Wingdings" w:hAnsi="Wingdings" w:hint="default"/>
+        <w:sz w:val="20"/>
+      </w:rPr>
+    </w:lvl>
+    <w:lvl w:ilvl="7" w:tentative="1">
+      <w:start w:val="1"/>
+      <w:numFmt w:val="bullet"/>
+      <w:lvlText w:val=""/>
+      <w:lvlJc w:val="left"/>
+      <w:pPr>
+        <w:tabs>
+          <w:tab w:val="num" w:pos="5760"/>
+        </w:tabs>
+        <w:ind w:left="5760" w:hanging="360"/>
+      </w:pPr>
+      <w:rPr>
+        <w:rFonts w:ascii="Wingdings" w:hAnsi="Wingdings" w:hint="default"/>
+        <w:sz w:val="20"/>
+      </w:rPr>
+    </w:lvl>
+    <w:lvl w:ilvl="8" w:tentative="1">
+      <w:start w:val="1"/>
+      <w:numFmt w:val="bullet"/>
+      <w:lvlText w:val=""/>
+      <w:lvlJc w:val="left"/>
+      <w:pPr>
+        <w:tabs>
+          <w:tab w:val="num" w:pos="6480"/>
+        </w:tabs>
+        <w:ind w:left="6480" w:hanging="360"/>
+      </w:pPr>
+      <w:rPr>
+        <w:rFonts w:ascii="Wingdings" w:hAnsi="Wingdings" w:hint="default"/>
+        <w:sz w:val="20"/>
+      </w:rPr>
+    </w:lvl>
+  </w:abstractNum>
+  <w:abstractNum w:abstractNumId="1" w15:restartNumberingAfterBreak="0">
+    <w:nsid w:val="11477C6C"/>
+    <w:multiLevelType w:val="multilevel"/>
+    <w:tmpl w:val="04C09698"/>
+    <w:lvl w:ilvl="0">
+      <w:start w:val="1"/>
+      <w:numFmt w:val="bullet"/>
+      <w:lvlText w:val=""/>
+      <w:lvlJc w:val="left"/>
+      <w:pPr>
+        <w:tabs>
+          <w:tab w:val="num" w:pos="720"/>
+        </w:tabs>
+        <w:ind w:left="720" w:hanging="360"/>
+      </w:pPr>
+      <w:rPr>
+        <w:rFonts w:ascii="Symbol" w:hAnsi="Symbol" w:hint="default"/>
+        <w:sz w:val="20"/>
+      </w:rPr>
+    </w:lvl>
+    <w:lvl w:ilvl="1" w:tentative="1">
+      <w:start w:val="1"/>
+      <w:numFmt w:val="bullet"/>
+      <w:lvlText w:val="o"/>
+      <w:lvlJc w:val="left"/>
+      <w:pPr>
+        <w:tabs>
+          <w:tab w:val="num" w:pos="1440"/>
+        </w:tabs>
+        <w:ind w:left="1440" w:hanging="360"/>
+      </w:pPr>
+      <w:rPr>
+        <w:rFonts w:ascii="Courier New" w:hAnsi="Courier New" w:hint="default"/>
+        <w:sz w:val="20"/>
+      </w:rPr>
+    </w:lvl>
+    <w:lvl w:ilvl="2" w:tentative="1">
+      <w:start w:val="1"/>
+      <w:numFmt w:val="bullet"/>
+      <w:lvlText w:val=""/>
+      <w:lvlJc w:val="left"/>
+      <w:pPr>
+        <w:tabs>
+          <w:tab w:val="num" w:pos="2160"/>
+        </w:tabs>
+        <w:ind w:left="2160" w:hanging="360"/>
+      </w:pPr>
+      <w:rPr>
+        <w:rFonts w:ascii="Wingdings" w:hAnsi="Wingdings" w:hint="default"/>
+        <w:sz w:val="20"/>
+      </w:rPr>
+    </w:lvl>
+    <w:lvl w:ilvl="3" w:tentative="1">
+      <w:start w:val="1"/>
+      <w:numFmt w:val="bullet"/>
+      <w:lvlText w:val=""/>
+      <w:lvlJc w:val="left"/>
+      <w:pPr>
+        <w:tabs>
+          <w:tab w:val="num" w:pos="2880"/>
+        </w:tabs>
+        <w:ind w:left="2880" w:hanging="360"/>
+      </w:pPr>
+      <w:rPr>
+        <w:rFonts w:ascii="Wingdings" w:hAnsi="Wingdings" w:hint="default"/>
+        <w:sz w:val="20"/>
+      </w:rPr>
+    </w:lvl>
+    <w:lvl w:ilvl="4" w:tentative="1">
+      <w:start w:val="1"/>
+      <w:numFmt w:val="bullet"/>
+      <w:lvlText w:val=""/>
+      <w:lvlJc w:val="left"/>
+      <w:pPr>
+        <w:tabs>
+          <w:tab w:val="num" w:pos="3600"/>
+        </w:tabs>
+        <w:ind w:left="3600" w:hanging="360"/>
+      </w:pPr>
+      <w:rPr>
+        <w:rFonts w:ascii="Wingdings" w:hAnsi="Wingdings" w:hint="default"/>
+        <w:sz w:val="20"/>
+      </w:rPr>
+    </w:lvl>
+    <w:lvl w:ilvl="5" w:tentative="1">
+      <w:start w:val="1"/>
+      <w:numFmt w:val="bullet"/>
+      <w:lvlText w:val=""/>
+      <w:lvlJc w:val="left"/>
+      <w:pPr>
+        <w:tabs>
+          <w:tab w:val="num" w:pos="4320"/>
+        </w:tabs>
+        <w:ind w:left="4320" w:hanging="360"/>
+      </w:pPr>
+      <w:rPr>
+        <w:rFonts w:ascii="Wingdings" w:hAnsi="Wingdings" w:hint="default"/>
+        <w:sz w:val="20"/>
+      </w:rPr>
+    </w:lvl>
+    <w:lvl w:ilvl="6" w:tentative="1">
+      <w:start w:val="1"/>
+      <w:numFmt w:val="bullet"/>
+      <w:lvlText w:val=""/>
+      <w:lvlJc w:val="left"/>
+      <w:pPr>
+        <w:tabs>
+          <w:tab w:val="num" w:pos="5040"/>
+        </w:tabs>
+        <w:ind w:left="5040" w:hanging="360"/>
+      </w:pPr>
+      <w:rPr>
+        <w:rFonts w:ascii="Wingdings" w:hAnsi="Wingdings" w:hint="default"/>
+        <w:sz w:val="20"/>
+      </w:rPr>
+    </w:lvl>
+    <w:lvl w:ilvl="7" w:tentative="1">
+      <w:start w:val="1"/>
+      <w:numFmt w:val="bullet"/>
+      <w:lvlText w:val=""/>
+      <w:lvlJc w:val="left"/>
+      <w:pPr>
+        <w:tabs>
+          <w:tab w:val="num" w:pos="5760"/>
+        </w:tabs>
+        <w:ind w:left="5760" w:hanging="360"/>
+      </w:pPr>
+      <w:rPr>
+        <w:rFonts w:ascii="Wingdings" w:hAnsi="Wingdings" w:hint="default"/>
+        <w:sz w:val="20"/>
+      </w:rPr>
+    </w:lvl>
+    <w:lvl w:ilvl="8" w:tentative="1">
+      <w:start w:val="1"/>
+      <w:numFmt w:val="bullet"/>
+      <w:lvlText w:val=""/>
+      <w:lvlJc w:val="left"/>
+      <w:pPr>
+        <w:tabs>
+          <w:tab w:val="num" w:pos="6480"/>
+        </w:tabs>
+        <w:ind w:left="6480" w:hanging="360"/>
+      </w:pPr>
+      <w:rPr>
+        <w:rFonts w:ascii="Wingdings" w:hAnsi="Wingdings" w:hint="default"/>
+        <w:sz w:val="20"/>
+      </w:rPr>
+    </w:lvl>
+  </w:abstractNum>
+  <w:abstractNum w:abstractNumId="2" w15:restartNumberingAfterBreak="0">
     <w:nsid w:val="20DB2F67"/>
     <w:multiLevelType w:val="multilevel"/>
     <w:tmpl w:val="8CE242FC"/>
@@ -774,7 +3645,567 @@
       </w:rPr>
     </w:lvl>
   </w:abstractNum>
-  <w:abstractNum w:abstractNumId="1" w15:restartNumberingAfterBreak="0">
+  <w:abstractNum w:abstractNumId="3" w15:restartNumberingAfterBreak="0">
+    <w:nsid w:val="35D32DBC"/>
+    <w:multiLevelType w:val="multilevel"/>
+    <w:tmpl w:val="8B26B650"/>
+    <w:lvl w:ilvl="0">
+      <w:start w:val="1"/>
+      <w:numFmt w:val="bullet"/>
+      <w:lvlText w:val=""/>
+      <w:lvlJc w:val="left"/>
+      <w:pPr>
+        <w:tabs>
+          <w:tab w:val="num" w:pos="720"/>
+        </w:tabs>
+        <w:ind w:left="720" w:hanging="360"/>
+      </w:pPr>
+      <w:rPr>
+        <w:rFonts w:ascii="Symbol" w:hAnsi="Symbol" w:hint="default"/>
+        <w:sz w:val="20"/>
+      </w:rPr>
+    </w:lvl>
+    <w:lvl w:ilvl="1" w:tentative="1">
+      <w:start w:val="1"/>
+      <w:numFmt w:val="bullet"/>
+      <w:lvlText w:val="o"/>
+      <w:lvlJc w:val="left"/>
+      <w:pPr>
+        <w:tabs>
+          <w:tab w:val="num" w:pos="1440"/>
+        </w:tabs>
+        <w:ind w:left="1440" w:hanging="360"/>
+      </w:pPr>
+      <w:rPr>
+        <w:rFonts w:ascii="Courier New" w:hAnsi="Courier New" w:hint="default"/>
+        <w:sz w:val="20"/>
+      </w:rPr>
+    </w:lvl>
+    <w:lvl w:ilvl="2" w:tentative="1">
+      <w:start w:val="1"/>
+      <w:numFmt w:val="bullet"/>
+      <w:lvlText w:val=""/>
+      <w:lvlJc w:val="left"/>
+      <w:pPr>
+        <w:tabs>
+          <w:tab w:val="num" w:pos="2160"/>
+        </w:tabs>
+        <w:ind w:left="2160" w:hanging="360"/>
+      </w:pPr>
+      <w:rPr>
+        <w:rFonts w:ascii="Wingdings" w:hAnsi="Wingdings" w:hint="default"/>
+        <w:sz w:val="20"/>
+      </w:rPr>
+    </w:lvl>
+    <w:lvl w:ilvl="3" w:tentative="1">
+      <w:start w:val="1"/>
+      <w:numFmt w:val="bullet"/>
+      <w:lvlText w:val=""/>
+      <w:lvlJc w:val="left"/>
+      <w:pPr>
+        <w:tabs>
+          <w:tab w:val="num" w:pos="2880"/>
+        </w:tabs>
+        <w:ind w:left="2880" w:hanging="360"/>
+      </w:pPr>
+      <w:rPr>
+        <w:rFonts w:ascii="Wingdings" w:hAnsi="Wingdings" w:hint="default"/>
+        <w:sz w:val="20"/>
+      </w:rPr>
+    </w:lvl>
+    <w:lvl w:ilvl="4" w:tentative="1">
+      <w:start w:val="1"/>
+      <w:numFmt w:val="bullet"/>
+      <w:lvlText w:val=""/>
+      <w:lvlJc w:val="left"/>
+      <w:pPr>
+        <w:tabs>
+          <w:tab w:val="num" w:pos="3600"/>
+        </w:tabs>
+        <w:ind w:left="3600" w:hanging="360"/>
+      </w:pPr>
+      <w:rPr>
+        <w:rFonts w:ascii="Wingdings" w:hAnsi="Wingdings" w:hint="default"/>
+        <w:sz w:val="20"/>
+      </w:rPr>
+    </w:lvl>
+    <w:lvl w:ilvl="5" w:tentative="1">
+      <w:start w:val="1"/>
+      <w:numFmt w:val="bullet"/>
+      <w:lvlText w:val=""/>
+      <w:lvlJc w:val="left"/>
+      <w:pPr>
+        <w:tabs>
+          <w:tab w:val="num" w:pos="4320"/>
+        </w:tabs>
+        <w:ind w:left="4320" w:hanging="360"/>
+      </w:pPr>
+      <w:rPr>
+        <w:rFonts w:ascii="Wingdings" w:hAnsi="Wingdings" w:hint="default"/>
+        <w:sz w:val="20"/>
+      </w:rPr>
+    </w:lvl>
+    <w:lvl w:ilvl="6" w:tentative="1">
+      <w:start w:val="1"/>
+      <w:numFmt w:val="bullet"/>
+      <w:lvlText w:val=""/>
+      <w:lvlJc w:val="left"/>
+      <w:pPr>
+        <w:tabs>
+          <w:tab w:val="num" w:pos="5040"/>
+        </w:tabs>
+        <w:ind w:left="5040" w:hanging="360"/>
+      </w:pPr>
+      <w:rPr>
+        <w:rFonts w:ascii="Wingdings" w:hAnsi="Wingdings" w:hint="default"/>
+        <w:sz w:val="20"/>
+      </w:rPr>
+    </w:lvl>
+    <w:lvl w:ilvl="7" w:tentative="1">
+      <w:start w:val="1"/>
+      <w:numFmt w:val="bullet"/>
+      <w:lvlText w:val=""/>
+      <w:lvlJc w:val="left"/>
+      <w:pPr>
+        <w:tabs>
+          <w:tab w:val="num" w:pos="5760"/>
+        </w:tabs>
+        <w:ind w:left="5760" w:hanging="360"/>
+      </w:pPr>
+      <w:rPr>
+        <w:rFonts w:ascii="Wingdings" w:hAnsi="Wingdings" w:hint="default"/>
+        <w:sz w:val="20"/>
+      </w:rPr>
+    </w:lvl>
+    <w:lvl w:ilvl="8" w:tentative="1">
+      <w:start w:val="1"/>
+      <w:numFmt w:val="bullet"/>
+      <w:lvlText w:val=""/>
+      <w:lvlJc w:val="left"/>
+      <w:pPr>
+        <w:tabs>
+          <w:tab w:val="num" w:pos="6480"/>
+        </w:tabs>
+        <w:ind w:left="6480" w:hanging="360"/>
+      </w:pPr>
+      <w:rPr>
+        <w:rFonts w:ascii="Wingdings" w:hAnsi="Wingdings" w:hint="default"/>
+        <w:sz w:val="20"/>
+      </w:rPr>
+    </w:lvl>
+  </w:abstractNum>
+  <w:abstractNum w:abstractNumId="4" w15:restartNumberingAfterBreak="0">
+    <w:nsid w:val="3ABB48EF"/>
+    <w:multiLevelType w:val="multilevel"/>
+    <w:tmpl w:val="79F6738A"/>
+    <w:lvl w:ilvl="0">
+      <w:start w:val="1"/>
+      <w:numFmt w:val="bullet"/>
+      <w:lvlText w:val=""/>
+      <w:lvlJc w:val="left"/>
+      <w:pPr>
+        <w:tabs>
+          <w:tab w:val="num" w:pos="720"/>
+        </w:tabs>
+        <w:ind w:left="720" w:hanging="360"/>
+      </w:pPr>
+      <w:rPr>
+        <w:rFonts w:ascii="Symbol" w:hAnsi="Symbol" w:hint="default"/>
+        <w:sz w:val="20"/>
+      </w:rPr>
+    </w:lvl>
+    <w:lvl w:ilvl="1" w:tentative="1">
+      <w:start w:val="1"/>
+      <w:numFmt w:val="bullet"/>
+      <w:lvlText w:val="o"/>
+      <w:lvlJc w:val="left"/>
+      <w:pPr>
+        <w:tabs>
+          <w:tab w:val="num" w:pos="1440"/>
+        </w:tabs>
+        <w:ind w:left="1440" w:hanging="360"/>
+      </w:pPr>
+      <w:rPr>
+        <w:rFonts w:ascii="Courier New" w:hAnsi="Courier New" w:hint="default"/>
+        <w:sz w:val="20"/>
+      </w:rPr>
+    </w:lvl>
+    <w:lvl w:ilvl="2" w:tentative="1">
+      <w:start w:val="1"/>
+      <w:numFmt w:val="bullet"/>
+      <w:lvlText w:val=""/>
+      <w:lvlJc w:val="left"/>
+      <w:pPr>
+        <w:tabs>
+          <w:tab w:val="num" w:pos="2160"/>
+        </w:tabs>
+        <w:ind w:left="2160" w:hanging="360"/>
+      </w:pPr>
+      <w:rPr>
+        <w:rFonts w:ascii="Wingdings" w:hAnsi="Wingdings" w:hint="default"/>
+        <w:sz w:val="20"/>
+      </w:rPr>
+    </w:lvl>
+    <w:lvl w:ilvl="3" w:tentative="1">
+      <w:start w:val="1"/>
+      <w:numFmt w:val="bullet"/>
+      <w:lvlText w:val=""/>
+      <w:lvlJc w:val="left"/>
+      <w:pPr>
+        <w:tabs>
+          <w:tab w:val="num" w:pos="2880"/>
+        </w:tabs>
+        <w:ind w:left="2880" w:hanging="360"/>
+      </w:pPr>
+      <w:rPr>
+        <w:rFonts w:ascii="Wingdings" w:hAnsi="Wingdings" w:hint="default"/>
+        <w:sz w:val="20"/>
+      </w:rPr>
+    </w:lvl>
+    <w:lvl w:ilvl="4" w:tentative="1">
+      <w:start w:val="1"/>
+      <w:numFmt w:val="bullet"/>
+      <w:lvlText w:val=""/>
+      <w:lvlJc w:val="left"/>
+      <w:pPr>
+        <w:tabs>
+          <w:tab w:val="num" w:pos="3600"/>
+        </w:tabs>
+        <w:ind w:left="3600" w:hanging="360"/>
+      </w:pPr>
+      <w:rPr>
+        <w:rFonts w:ascii="Wingdings" w:hAnsi="Wingdings" w:hint="default"/>
+        <w:sz w:val="20"/>
+      </w:rPr>
+    </w:lvl>
+    <w:lvl w:ilvl="5" w:tentative="1">
+      <w:start w:val="1"/>
+      <w:numFmt w:val="bullet"/>
+      <w:lvlText w:val=""/>
+      <w:lvlJc w:val="left"/>
+      <w:pPr>
+        <w:tabs>
+          <w:tab w:val="num" w:pos="4320"/>
+        </w:tabs>
+        <w:ind w:left="4320" w:hanging="360"/>
+      </w:pPr>
+      <w:rPr>
+        <w:rFonts w:ascii="Wingdings" w:hAnsi="Wingdings" w:hint="default"/>
+        <w:sz w:val="20"/>
+      </w:rPr>
+    </w:lvl>
+    <w:lvl w:ilvl="6" w:tentative="1">
+      <w:start w:val="1"/>
+      <w:numFmt w:val="bullet"/>
+      <w:lvlText w:val=""/>
+      <w:lvlJc w:val="left"/>
+      <w:pPr>
+        <w:tabs>
+          <w:tab w:val="num" w:pos="5040"/>
+        </w:tabs>
+        <w:ind w:left="5040" w:hanging="360"/>
+      </w:pPr>
+      <w:rPr>
+        <w:rFonts w:ascii="Wingdings" w:hAnsi="Wingdings" w:hint="default"/>
+        <w:sz w:val="20"/>
+      </w:rPr>
+    </w:lvl>
+    <w:lvl w:ilvl="7" w:tentative="1">
+      <w:start w:val="1"/>
+      <w:numFmt w:val="bullet"/>
+      <w:lvlText w:val=""/>
+      <w:lvlJc w:val="left"/>
+      <w:pPr>
+        <w:tabs>
+          <w:tab w:val="num" w:pos="5760"/>
+        </w:tabs>
+        <w:ind w:left="5760" w:hanging="360"/>
+      </w:pPr>
+      <w:rPr>
+        <w:rFonts w:ascii="Wingdings" w:hAnsi="Wingdings" w:hint="default"/>
+        <w:sz w:val="20"/>
+      </w:rPr>
+    </w:lvl>
+    <w:lvl w:ilvl="8" w:tentative="1">
+      <w:start w:val="1"/>
+      <w:numFmt w:val="bullet"/>
+      <w:lvlText w:val=""/>
+      <w:lvlJc w:val="left"/>
+      <w:pPr>
+        <w:tabs>
+          <w:tab w:val="num" w:pos="6480"/>
+        </w:tabs>
+        <w:ind w:left="6480" w:hanging="360"/>
+      </w:pPr>
+      <w:rPr>
+        <w:rFonts w:ascii="Wingdings" w:hAnsi="Wingdings" w:hint="default"/>
+        <w:sz w:val="20"/>
+      </w:rPr>
+    </w:lvl>
+  </w:abstractNum>
+  <w:abstractNum w:abstractNumId="5" w15:restartNumberingAfterBreak="0">
+    <w:nsid w:val="4B0B1DD5"/>
+    <w:multiLevelType w:val="hybridMultilevel"/>
+    <w:tmpl w:val="57DAA1FE"/>
+    <w:lvl w:ilvl="0" w:tplc="40090001">
+      <w:start w:val="1"/>
+      <w:numFmt w:val="bullet"/>
+      <w:lvlText w:val=""/>
+      <w:lvlJc w:val="left"/>
+      <w:pPr>
+        <w:ind w:left="720" w:hanging="360"/>
+      </w:pPr>
+      <w:rPr>
+        <w:rFonts w:ascii="Symbol" w:hAnsi="Symbol" w:hint="default"/>
+      </w:rPr>
+    </w:lvl>
+    <w:lvl w:ilvl="1" w:tplc="40090003" w:tentative="1">
+      <w:start w:val="1"/>
+      <w:numFmt w:val="bullet"/>
+      <w:lvlText w:val="o"/>
+      <w:lvlJc w:val="left"/>
+      <w:pPr>
+        <w:ind w:left="1440" w:hanging="360"/>
+      </w:pPr>
+      <w:rPr>
+        <w:rFonts w:ascii="Courier New" w:hAnsi="Courier New" w:cs="Courier New" w:hint="default"/>
+      </w:rPr>
+    </w:lvl>
+    <w:lvl w:ilvl="2" w:tplc="40090005" w:tentative="1">
+      <w:start w:val="1"/>
+      <w:numFmt w:val="bullet"/>
+      <w:lvlText w:val=""/>
+      <w:lvlJc w:val="left"/>
+      <w:pPr>
+        <w:ind w:left="2160" w:hanging="360"/>
+      </w:pPr>
+      <w:rPr>
+        <w:rFonts w:ascii="Wingdings" w:hAnsi="Wingdings" w:hint="default"/>
+      </w:rPr>
+    </w:lvl>
+    <w:lvl w:ilvl="3" w:tplc="40090001" w:tentative="1">
+      <w:start w:val="1"/>
+      <w:numFmt w:val="bullet"/>
+      <w:lvlText w:val=""/>
+      <w:lvlJc w:val="left"/>
+      <w:pPr>
+        <w:ind w:left="2880" w:hanging="360"/>
+      </w:pPr>
+      <w:rPr>
+        <w:rFonts w:ascii="Symbol" w:hAnsi="Symbol" w:hint="default"/>
+      </w:rPr>
+    </w:lvl>
+    <w:lvl w:ilvl="4" w:tplc="40090003" w:tentative="1">
+      <w:start w:val="1"/>
+      <w:numFmt w:val="bullet"/>
+      <w:lvlText w:val="o"/>
+      <w:lvlJc w:val="left"/>
+      <w:pPr>
+        <w:ind w:left="3600" w:hanging="360"/>
+      </w:pPr>
+      <w:rPr>
+        <w:rFonts w:ascii="Courier New" w:hAnsi="Courier New" w:cs="Courier New" w:hint="default"/>
+      </w:rPr>
+    </w:lvl>
+    <w:lvl w:ilvl="5" w:tplc="40090005" w:tentative="1">
+      <w:start w:val="1"/>
+      <w:numFmt w:val="bullet"/>
+      <w:lvlText w:val=""/>
+      <w:lvlJc w:val="left"/>
+      <w:pPr>
+        <w:ind w:left="4320" w:hanging="360"/>
+      </w:pPr>
+      <w:rPr>
+        <w:rFonts w:ascii="Wingdings" w:hAnsi="Wingdings" w:hint="default"/>
+      </w:rPr>
+    </w:lvl>
+    <w:lvl w:ilvl="6" w:tplc="40090001" w:tentative="1">
+      <w:start w:val="1"/>
+      <w:numFmt w:val="bullet"/>
+      <w:lvlText w:val=""/>
+      <w:lvlJc w:val="left"/>
+      <w:pPr>
+        <w:ind w:left="5040" w:hanging="360"/>
+      </w:pPr>
+      <w:rPr>
+        <w:rFonts w:ascii="Symbol" w:hAnsi="Symbol" w:hint="default"/>
+      </w:rPr>
+    </w:lvl>
+    <w:lvl w:ilvl="7" w:tplc="40090003" w:tentative="1">
+      <w:start w:val="1"/>
+      <w:numFmt w:val="bullet"/>
+      <w:lvlText w:val="o"/>
+      <w:lvlJc w:val="left"/>
+      <w:pPr>
+        <w:ind w:left="5760" w:hanging="360"/>
+      </w:pPr>
+      <w:rPr>
+        <w:rFonts w:ascii="Courier New" w:hAnsi="Courier New" w:cs="Courier New" w:hint="default"/>
+      </w:rPr>
+    </w:lvl>
+    <w:lvl w:ilvl="8" w:tplc="40090005" w:tentative="1">
+      <w:start w:val="1"/>
+      <w:numFmt w:val="bullet"/>
+      <w:lvlText w:val=""/>
+      <w:lvlJc w:val="left"/>
+      <w:pPr>
+        <w:ind w:left="6480" w:hanging="360"/>
+      </w:pPr>
+      <w:rPr>
+        <w:rFonts w:ascii="Wingdings" w:hAnsi="Wingdings" w:hint="default"/>
+      </w:rPr>
+    </w:lvl>
+  </w:abstractNum>
+  <w:abstractNum w:abstractNumId="6" w15:restartNumberingAfterBreak="0">
+    <w:nsid w:val="5C5C0579"/>
+    <w:multiLevelType w:val="multilevel"/>
+    <w:tmpl w:val="46CC50C0"/>
+    <w:lvl w:ilvl="0">
+      <w:start w:val="1"/>
+      <w:numFmt w:val="bullet"/>
+      <w:lvlText w:val=""/>
+      <w:lvlJc w:val="left"/>
+      <w:pPr>
+        <w:tabs>
+          <w:tab w:val="num" w:pos="720"/>
+        </w:tabs>
+        <w:ind w:left="720" w:hanging="360"/>
+      </w:pPr>
+      <w:rPr>
+        <w:rFonts w:ascii="Symbol" w:hAnsi="Symbol" w:hint="default"/>
+        <w:sz w:val="20"/>
+      </w:rPr>
+    </w:lvl>
+    <w:lvl w:ilvl="1" w:tentative="1">
+      <w:start w:val="1"/>
+      <w:numFmt w:val="bullet"/>
+      <w:lvlText w:val="o"/>
+      <w:lvlJc w:val="left"/>
+      <w:pPr>
+        <w:tabs>
+          <w:tab w:val="num" w:pos="1440"/>
+        </w:tabs>
+        <w:ind w:left="1440" w:hanging="360"/>
+      </w:pPr>
+      <w:rPr>
+        <w:rFonts w:ascii="Courier New" w:hAnsi="Courier New" w:hint="default"/>
+        <w:sz w:val="20"/>
+      </w:rPr>
+    </w:lvl>
+    <w:lvl w:ilvl="2" w:tentative="1">
+      <w:start w:val="1"/>
+      <w:numFmt w:val="bullet"/>
+      <w:lvlText w:val=""/>
+      <w:lvlJc w:val="left"/>
+      <w:pPr>
+        <w:tabs>
+          <w:tab w:val="num" w:pos="2160"/>
+        </w:tabs>
+        <w:ind w:left="2160" w:hanging="360"/>
+      </w:pPr>
+      <w:rPr>
+        <w:rFonts w:ascii="Wingdings" w:hAnsi="Wingdings" w:hint="default"/>
+        <w:sz w:val="20"/>
+      </w:rPr>
+    </w:lvl>
+    <w:lvl w:ilvl="3" w:tentative="1">
+      <w:start w:val="1"/>
+      <w:numFmt w:val="bullet"/>
+      <w:lvlText w:val=""/>
+      <w:lvlJc w:val="left"/>
+      <w:pPr>
+        <w:tabs>
+          <w:tab w:val="num" w:pos="2880"/>
+        </w:tabs>
+        <w:ind w:left="2880" w:hanging="360"/>
+      </w:pPr>
+      <w:rPr>
+        <w:rFonts w:ascii="Wingdings" w:hAnsi="Wingdings" w:hint="default"/>
+        <w:sz w:val="20"/>
+      </w:rPr>
+    </w:lvl>
+    <w:lvl w:ilvl="4" w:tentative="1">
+      <w:start w:val="1"/>
+      <w:numFmt w:val="bullet"/>
+      <w:lvlText w:val=""/>
+      <w:lvlJc w:val="left"/>
+      <w:pPr>
+        <w:tabs>
+          <w:tab w:val="num" w:pos="3600"/>
+        </w:tabs>
+        <w:ind w:left="3600" w:hanging="360"/>
+      </w:pPr>
+      <w:rPr>
+        <w:rFonts w:ascii="Wingdings" w:hAnsi="Wingdings" w:hint="default"/>
+        <w:sz w:val="20"/>
+      </w:rPr>
+    </w:lvl>
+    <w:lvl w:ilvl="5" w:tentative="1">
+      <w:start w:val="1"/>
+      <w:numFmt w:val="bullet"/>
+      <w:lvlText w:val=""/>
+      <w:lvlJc w:val="left"/>
+      <w:pPr>
+        <w:tabs>
+          <w:tab w:val="num" w:pos="4320"/>
+        </w:tabs>
+        <w:ind w:left="4320" w:hanging="360"/>
+      </w:pPr>
+      <w:rPr>
+        <w:rFonts w:ascii="Wingdings" w:hAnsi="Wingdings" w:hint="default"/>
+        <w:sz w:val="20"/>
+      </w:rPr>
+    </w:lvl>
+    <w:lvl w:ilvl="6" w:tentative="1">
+      <w:start w:val="1"/>
+      <w:numFmt w:val="bullet"/>
+      <w:lvlText w:val=""/>
+      <w:lvlJc w:val="left"/>
+      <w:pPr>
+        <w:tabs>
+          <w:tab w:val="num" w:pos="5040"/>
+        </w:tabs>
+        <w:ind w:left="5040" w:hanging="360"/>
+      </w:pPr>
+      <w:rPr>
+        <w:rFonts w:ascii="Wingdings" w:hAnsi="Wingdings" w:hint="default"/>
+        <w:sz w:val="20"/>
+      </w:rPr>
+    </w:lvl>
+    <w:lvl w:ilvl="7" w:tentative="1">
+      <w:start w:val="1"/>
+      <w:numFmt w:val="bullet"/>
+      <w:lvlText w:val=""/>
+      <w:lvlJc w:val="left"/>
+      <w:pPr>
+        <w:tabs>
+          <w:tab w:val="num" w:pos="5760"/>
+        </w:tabs>
+        <w:ind w:left="5760" w:hanging="360"/>
+      </w:pPr>
+      <w:rPr>
+        <w:rFonts w:ascii="Wingdings" w:hAnsi="Wingdings" w:hint="default"/>
+        <w:sz w:val="20"/>
+      </w:rPr>
+    </w:lvl>
+    <w:lvl w:ilvl="8" w:tentative="1">
+      <w:start w:val="1"/>
+      <w:numFmt w:val="bullet"/>
+      <w:lvlText w:val=""/>
+      <w:lvlJc w:val="left"/>
+      <w:pPr>
+        <w:tabs>
+          <w:tab w:val="num" w:pos="6480"/>
+        </w:tabs>
+        <w:ind w:left="6480" w:hanging="360"/>
+      </w:pPr>
+      <w:rPr>
+        <w:rFonts w:ascii="Wingdings" w:hAnsi="Wingdings" w:hint="default"/>
+        <w:sz w:val="20"/>
+      </w:rPr>
+    </w:lvl>
+  </w:abstractNum>
+  <w:abstractNum w:abstractNumId="7" w15:restartNumberingAfterBreak="0">
     <w:nsid w:val="6B847D88"/>
     <w:multiLevelType w:val="multilevel"/>
     <w:tmpl w:val="5280848E"/>
@@ -924,10 +4355,28 @@
     </w:lvl>
   </w:abstractNum>
   <w:num w:numId="1" w16cid:durableId="643387687">
-    <w:abstractNumId w:val="0"/>
+    <w:abstractNumId w:val="2"/>
   </w:num>
   <w:num w:numId="2" w16cid:durableId="1295257770">
+    <w:abstractNumId w:val="7"/>
+  </w:num>
+  <w:num w:numId="3" w16cid:durableId="801121461">
+    <w:abstractNumId w:val="6"/>
+  </w:num>
+  <w:num w:numId="4" w16cid:durableId="1514412829">
+    <w:abstractNumId w:val="5"/>
+  </w:num>
+  <w:num w:numId="5" w16cid:durableId="1463495210">
+    <w:abstractNumId w:val="3"/>
+  </w:num>
+  <w:num w:numId="6" w16cid:durableId="1715153353">
     <w:abstractNumId w:val="1"/>
+  </w:num>
+  <w:num w:numId="7" w16cid:durableId="48652819">
+    <w:abstractNumId w:val="4"/>
+  </w:num>
+  <w:num w:numId="8" w16cid:durableId="394549773">
+    <w:abstractNumId w:val="0"/>
   </w:num>
 </w:numbering>
 </file>

</xml_diff>